<commit_message>
docs: finalize lab report and drop Word lock/temp files
</commit_message>
<xml_diff>
--- a/docs/实验报告.docx
+++ b/docs/实验报告.docx
@@ -135,6 +135,7 @@
         </w:rPr>
         <w:t>三种模型架构，对</w:t>
       </w:r>
+      <w:proofErr w:type="spellStart"/>
       <w:r>
         <w:rPr>
           <w:rFonts w:ascii="Times New Roman" w:eastAsia="SimSun" w:hAnsi="Times New Roman" w:cs="DengXian" w:hint="eastAsia"/>
@@ -144,6 +145,7 @@
         </w:rPr>
         <w:t>kaggel</w:t>
       </w:r>
+      <w:proofErr w:type="spellEnd"/>
       <w:r>
         <w:rPr>
           <w:rFonts w:ascii="Times New Roman" w:eastAsia="SimSun" w:hAnsi="Times New Roman" w:cs="DengXian" w:hint="eastAsia"/>
@@ -153,6 +155,7 @@
         </w:rPr>
         <w:t>数据集中的猫狗图像进行分类。我使用</w:t>
       </w:r>
+      <w:proofErr w:type="spellStart"/>
       <w:r>
         <w:rPr>
           <w:rFonts w:ascii="Times New Roman" w:eastAsia="SimSun" w:hAnsi="Times New Roman" w:cs="DengXian" w:hint="eastAsia"/>
@@ -162,6 +165,7 @@
         </w:rPr>
         <w:t>pytorch</w:t>
       </w:r>
+      <w:proofErr w:type="spellEnd"/>
       <w:r>
         <w:rPr>
           <w:rFonts w:ascii="Times New Roman" w:eastAsia="SimSun" w:hAnsi="Times New Roman" w:cs="DengXian" w:hint="eastAsia"/>
@@ -409,6 +413,7 @@
         </w:rPr>
         <w:t>输出的是非固定尺寸的图像（用于进行</w:t>
       </w:r>
+      <w:proofErr w:type="spellStart"/>
       <w:r>
         <w:rPr>
           <w:rFonts w:ascii="Times New Roman" w:eastAsia="SimSun" w:hAnsi="Times New Roman" w:cs="DengXian" w:hint="eastAsia"/>
@@ -418,6 +423,7 @@
         </w:rPr>
         <w:t>CNN+attention</w:t>
       </w:r>
+      <w:proofErr w:type="spellEnd"/>
       <w:r>
         <w:rPr>
           <w:rFonts w:ascii="Times New Roman" w:eastAsia="SimSun" w:hAnsi="Times New Roman" w:cs="DengXian" w:hint="eastAsia"/>
@@ -427,6 +433,7 @@
         </w:rPr>
         <w:t>的训练，详见第六节：</w:t>
       </w:r>
+      <w:proofErr w:type="spellStart"/>
       <w:r>
         <w:rPr>
           <w:rFonts w:ascii="Times New Roman" w:eastAsia="SimSun" w:hAnsi="Times New Roman" w:cs="DengXian" w:hint="eastAsia"/>
@@ -436,6 +443,7 @@
         </w:rPr>
         <w:t>CNN+attention</w:t>
       </w:r>
+      <w:proofErr w:type="spellEnd"/>
       <w:r>
         <w:rPr>
           <w:rFonts w:ascii="Times New Roman" w:eastAsia="SimSun" w:hAnsi="Times New Roman" w:cs="DengXian" w:hint="eastAsia"/>
@@ -1212,6 +1220,7 @@
                 <w:szCs w:val="24"/>
               </w:rPr>
             </w:pPr>
+            <w:proofErr w:type="spellStart"/>
             <w:r>
               <w:rPr>
                 <w:rFonts w:ascii="Times New Roman" w:eastAsia="SimSun" w:hAnsi="Times New Roman" w:cs="DengXian"/>
@@ -1223,6 +1232,7 @@
               </w:rPr>
               <w:t>val_acc</w:t>
             </w:r>
+            <w:proofErr w:type="spellEnd"/>
           </w:p>
         </w:tc>
         <w:tc>
@@ -1327,6 +1337,7 @@
                 <w:szCs w:val="24"/>
               </w:rPr>
             </w:pPr>
+            <w:proofErr w:type="spellStart"/>
             <w:r>
               <w:rPr>
                 <w:rFonts w:ascii="Times New Roman" w:eastAsia="SimSun" w:hAnsi="Times New Roman" w:cs="DengXian"/>
@@ -1336,6 +1347,7 @@
               </w:rPr>
               <w:t>val_loss</w:t>
             </w:r>
+            <w:proofErr w:type="spellEnd"/>
           </w:p>
         </w:tc>
         <w:tc>
@@ -1411,6 +1423,7 @@
                 <w:szCs w:val="24"/>
               </w:rPr>
             </w:pPr>
+            <w:proofErr w:type="spellStart"/>
             <w:r>
               <w:rPr>
                 <w:rFonts w:ascii="Times New Roman" w:eastAsia="SimSun" w:hAnsi="Times New Roman" w:cs="DengXian"/>
@@ -1420,6 +1433,7 @@
               </w:rPr>
               <w:t>lr</w:t>
             </w:r>
+            <w:proofErr w:type="spellEnd"/>
           </w:p>
         </w:tc>
         <w:tc>
@@ -1488,6 +1502,7 @@
                 <w:szCs w:val="24"/>
               </w:rPr>
             </w:pPr>
+            <w:proofErr w:type="spellStart"/>
             <w:r>
               <w:rPr>
                 <w:rFonts w:ascii="Times New Roman" w:eastAsia="SimSun" w:hAnsi="Times New Roman" w:cs="DengXian"/>
@@ -1497,6 +1512,7 @@
               </w:rPr>
               <w:t>weight_decay</w:t>
             </w:r>
+            <w:proofErr w:type="spellEnd"/>
           </w:p>
         </w:tc>
         <w:tc>
@@ -1642,6 +1658,7 @@
                 <w:szCs w:val="24"/>
               </w:rPr>
             </w:pPr>
+            <w:proofErr w:type="spellStart"/>
             <w:r>
               <w:rPr>
                 <w:rFonts w:ascii="Times New Roman" w:eastAsia="SimSun" w:hAnsi="Times New Roman" w:cs="DengXian"/>
@@ -1651,6 +1668,7 @@
               </w:rPr>
               <w:t>batch_size</w:t>
             </w:r>
+            <w:proofErr w:type="spellEnd"/>
           </w:p>
         </w:tc>
         <w:tc>
@@ -1760,14 +1778,25 @@
                 <w:szCs w:val="24"/>
               </w:rPr>
             </w:pPr>
-            <w:r>
-              <w:rPr>
-                <w:rFonts w:ascii="Times New Roman" w:eastAsia="SimSun" w:hAnsi="Times New Roman" w:cs="DengXian"/>
-                <w:kern w:val="0"/>
-                <w:sz w:val="24"/>
-                <w:szCs w:val="24"/>
-              </w:rPr>
-              <w:t xml:space="preserve">hidden_dim </w:t>
+            <w:proofErr w:type="spellStart"/>
+            <w:r>
+              <w:rPr>
+                <w:rFonts w:ascii="Times New Roman" w:eastAsia="SimSun" w:hAnsi="Times New Roman" w:cs="DengXian"/>
+                <w:kern w:val="0"/>
+                <w:sz w:val="24"/>
+                <w:szCs w:val="24"/>
+              </w:rPr>
+              <w:t>hidden_dim</w:t>
+            </w:r>
+            <w:proofErr w:type="spellEnd"/>
+            <w:r>
+              <w:rPr>
+                <w:rFonts w:ascii="Times New Roman" w:eastAsia="SimSun" w:hAnsi="Times New Roman" w:cs="DengXian"/>
+                <w:kern w:val="0"/>
+                <w:sz w:val="24"/>
+                <w:szCs w:val="24"/>
+              </w:rPr>
+              <w:t xml:space="preserve"> </w:t>
             </w:r>
             <w:r>
               <w:rPr>
@@ -1874,14 +1903,25 @@
         </w:rPr>
         <w:t>利用</w:t>
       </w:r>
-      <w:r>
-        <w:rPr>
-          <w:rFonts w:ascii="Times New Roman" w:eastAsia="SimSun" w:hAnsi="Times New Roman" w:cs="DengXian" w:hint="eastAsia"/>
-          <w:kern w:val="0"/>
-          <w:sz w:val="24"/>
-          <w:szCs w:val="24"/>
-        </w:rPr>
-        <w:t>Deepseek Harness</w:t>
+      <w:proofErr w:type="spellStart"/>
+      <w:r>
+        <w:rPr>
+          <w:rFonts w:ascii="Times New Roman" w:eastAsia="SimSun" w:hAnsi="Times New Roman" w:cs="DengXian" w:hint="eastAsia"/>
+          <w:kern w:val="0"/>
+          <w:sz w:val="24"/>
+          <w:szCs w:val="24"/>
+        </w:rPr>
+        <w:t>Deepseek</w:t>
+      </w:r>
+      <w:proofErr w:type="spellEnd"/>
+      <w:r>
+        <w:rPr>
+          <w:rFonts w:ascii="Times New Roman" w:eastAsia="SimSun" w:hAnsi="Times New Roman" w:cs="DengXian" w:hint="eastAsia"/>
+          <w:kern w:val="0"/>
+          <w:sz w:val="24"/>
+          <w:szCs w:val="24"/>
+        </w:rPr>
+        <w:t xml:space="preserve"> Harness</w:t>
       </w:r>
       <w:r>
         <w:rPr>
@@ -2459,6 +2499,7 @@
         </w:rPr>
         <w:t>的</w:t>
       </w:r>
+      <w:proofErr w:type="spellStart"/>
       <w:r>
         <w:rPr>
           <w:rFonts w:ascii="Times New Roman" w:eastAsia="SimSun" w:hAnsi="Times New Roman" w:cs="DengXian" w:hint="eastAsia"/>
@@ -2468,6 +2509,7 @@
         </w:rPr>
         <w:t>ResNet</w:t>
       </w:r>
+      <w:proofErr w:type="spellEnd"/>
       <w:r>
         <w:rPr>
           <w:rFonts w:ascii="Times New Roman" w:eastAsia="SimSun" w:hAnsi="Times New Roman" w:cs="DengXian" w:hint="eastAsia"/>
@@ -2611,6 +2653,7 @@
                 <w:szCs w:val="24"/>
               </w:rPr>
             </w:pPr>
+            <w:proofErr w:type="spellStart"/>
             <w:r>
               <w:rPr>
                 <w:rFonts w:ascii="Times New Roman" w:eastAsia="SimSun" w:hAnsi="Times New Roman" w:cs="DengXian"/>
@@ -2622,6 +2665,7 @@
               </w:rPr>
               <w:t>val_acc</w:t>
             </w:r>
+            <w:proofErr w:type="spellEnd"/>
           </w:p>
         </w:tc>
         <w:tc>
@@ -2704,6 +2748,7 @@
                 <w:szCs w:val="24"/>
               </w:rPr>
             </w:pPr>
+            <w:proofErr w:type="spellStart"/>
             <w:r>
               <w:rPr>
                 <w:rFonts w:ascii="Times New Roman" w:eastAsia="SimSun" w:hAnsi="Times New Roman" w:cs="DengXian"/>
@@ -2713,6 +2758,7 @@
               </w:rPr>
               <w:t>val_loss</w:t>
             </w:r>
+            <w:proofErr w:type="spellEnd"/>
           </w:p>
         </w:tc>
         <w:tc>
@@ -2788,6 +2834,7 @@
                 <w:szCs w:val="24"/>
               </w:rPr>
             </w:pPr>
+            <w:proofErr w:type="spellStart"/>
             <w:r>
               <w:rPr>
                 <w:rFonts w:ascii="Times New Roman" w:eastAsia="SimSun" w:hAnsi="Times New Roman" w:cs="DengXian"/>
@@ -2797,6 +2844,7 @@
               </w:rPr>
               <w:t>lr</w:t>
             </w:r>
+            <w:proofErr w:type="spellEnd"/>
           </w:p>
         </w:tc>
         <w:tc>
@@ -2909,6 +2957,7 @@
                 <w:szCs w:val="24"/>
               </w:rPr>
             </w:pPr>
+            <w:proofErr w:type="spellStart"/>
             <w:r>
               <w:rPr>
                 <w:rFonts w:ascii="Times New Roman" w:eastAsia="SimSun" w:hAnsi="Times New Roman" w:cs="DengXian"/>
@@ -2918,6 +2967,7 @@
               </w:rPr>
               <w:t>weight_decay</w:t>
             </w:r>
+            <w:proofErr w:type="spellEnd"/>
           </w:p>
         </w:tc>
         <w:tc>
@@ -3075,6 +3125,7 @@
                 <w:szCs w:val="24"/>
               </w:rPr>
             </w:pPr>
+            <w:proofErr w:type="spellStart"/>
             <w:r>
               <w:rPr>
                 <w:rFonts w:ascii="Times New Roman" w:eastAsia="SimSun" w:hAnsi="Times New Roman" w:cs="DengXian"/>
@@ -3084,6 +3135,7 @@
               </w:rPr>
               <w:t>batch_size</w:t>
             </w:r>
+            <w:proofErr w:type="spellEnd"/>
           </w:p>
         </w:tc>
         <w:tc>
@@ -3193,14 +3245,25 @@
                 <w:szCs w:val="24"/>
               </w:rPr>
             </w:pPr>
-            <w:r>
-              <w:rPr>
-                <w:rFonts w:ascii="Times New Roman" w:eastAsia="SimSun" w:hAnsi="Times New Roman" w:cs="DengXian"/>
-                <w:kern w:val="0"/>
-                <w:sz w:val="24"/>
-                <w:szCs w:val="24"/>
-              </w:rPr>
-              <w:t>base_width 64, layers (2,2,2,2)</w:t>
+            <w:proofErr w:type="spellStart"/>
+            <w:r>
+              <w:rPr>
+                <w:rFonts w:ascii="Times New Roman" w:eastAsia="SimSun" w:hAnsi="Times New Roman" w:cs="DengXian"/>
+                <w:kern w:val="0"/>
+                <w:sz w:val="24"/>
+                <w:szCs w:val="24"/>
+              </w:rPr>
+              <w:t>base_width</w:t>
+            </w:r>
+            <w:proofErr w:type="spellEnd"/>
+            <w:r>
+              <w:rPr>
+                <w:rFonts w:ascii="Times New Roman" w:eastAsia="SimSun" w:hAnsi="Times New Roman" w:cs="DengXian"/>
+                <w:kern w:val="0"/>
+                <w:sz w:val="24"/>
+                <w:szCs w:val="24"/>
+              </w:rPr>
+              <w:t xml:space="preserve"> 64, layers (2,2,2,2)</w:t>
             </w:r>
           </w:p>
         </w:tc>
@@ -3294,14 +3357,25 @@
         </w:rPr>
         <w:t>利用</w:t>
       </w:r>
-      <w:r>
-        <w:rPr>
-          <w:rFonts w:ascii="Times New Roman" w:eastAsia="SimSun" w:hAnsi="Times New Roman" w:cs="DengXian" w:hint="eastAsia"/>
-          <w:kern w:val="0"/>
-          <w:sz w:val="24"/>
-          <w:szCs w:val="24"/>
-        </w:rPr>
-        <w:t>Deepseek Harness</w:t>
+      <w:proofErr w:type="spellStart"/>
+      <w:r>
+        <w:rPr>
+          <w:rFonts w:ascii="Times New Roman" w:eastAsia="SimSun" w:hAnsi="Times New Roman" w:cs="DengXian" w:hint="eastAsia"/>
+          <w:kern w:val="0"/>
+          <w:sz w:val="24"/>
+          <w:szCs w:val="24"/>
+        </w:rPr>
+        <w:t>Deepseek</w:t>
+      </w:r>
+      <w:proofErr w:type="spellEnd"/>
+      <w:r>
+        <w:rPr>
+          <w:rFonts w:ascii="Times New Roman" w:eastAsia="SimSun" w:hAnsi="Times New Roman" w:cs="DengXian" w:hint="eastAsia"/>
+          <w:kern w:val="0"/>
+          <w:sz w:val="24"/>
+          <w:szCs w:val="24"/>
+        </w:rPr>
+        <w:t xml:space="preserve"> Harness</w:t>
       </w:r>
       <w:r>
         <w:rPr>
@@ -3793,6 +3867,7 @@
           <w:szCs w:val="24"/>
         </w:rPr>
       </w:pPr>
+      <w:proofErr w:type="spellStart"/>
       <w:r>
         <w:rPr>
           <w:rFonts w:ascii="Times New Roman" w:eastAsia="SimSun" w:hAnsi="Times New Roman" w:cs="DengXian" w:hint="eastAsia"/>
@@ -3802,6 +3877,7 @@
         </w:rPr>
         <w:t>BiLSTM</w:t>
       </w:r>
+      <w:proofErr w:type="spellEnd"/>
       <w:r>
         <w:rPr>
           <w:rFonts w:ascii="Times New Roman" w:eastAsia="SimSun" w:hAnsi="Times New Roman" w:cs="DengXian" w:hint="eastAsia"/>
@@ -4258,6 +4334,7 @@
                 <w:szCs w:val="24"/>
               </w:rPr>
             </w:pPr>
+            <w:proofErr w:type="spellStart"/>
             <w:r>
               <w:rPr>
                 <w:rFonts w:ascii="Times New Roman" w:eastAsia="SimSun" w:hAnsi="Times New Roman" w:cs="DengXian"/>
@@ -4269,6 +4346,7 @@
               </w:rPr>
               <w:t>val_acc</w:t>
             </w:r>
+            <w:proofErr w:type="spellEnd"/>
           </w:p>
         </w:tc>
         <w:tc>
@@ -4351,6 +4429,7 @@
                 <w:szCs w:val="24"/>
               </w:rPr>
             </w:pPr>
+            <w:proofErr w:type="spellStart"/>
             <w:r>
               <w:rPr>
                 <w:rFonts w:ascii="Times New Roman" w:eastAsia="SimSun" w:hAnsi="Times New Roman" w:cs="DengXian"/>
@@ -4360,6 +4439,7 @@
               </w:rPr>
               <w:t>val_loss</w:t>
             </w:r>
+            <w:proofErr w:type="spellEnd"/>
           </w:p>
         </w:tc>
         <w:tc>
@@ -4435,6 +4515,7 @@
                 <w:szCs w:val="24"/>
               </w:rPr>
             </w:pPr>
+            <w:proofErr w:type="spellStart"/>
             <w:r>
               <w:rPr>
                 <w:rFonts w:ascii="Times New Roman" w:eastAsia="SimSun" w:hAnsi="Times New Roman" w:cs="DengXian"/>
@@ -4444,6 +4525,7 @@
               </w:rPr>
               <w:t>lr</w:t>
             </w:r>
+            <w:proofErr w:type="spellEnd"/>
           </w:p>
         </w:tc>
         <w:tc>
@@ -4556,6 +4638,7 @@
                 <w:szCs w:val="24"/>
               </w:rPr>
             </w:pPr>
+            <w:proofErr w:type="spellStart"/>
             <w:r>
               <w:rPr>
                 <w:rFonts w:ascii="Times New Roman" w:eastAsia="SimSun" w:hAnsi="Times New Roman" w:cs="DengXian"/>
@@ -4565,6 +4648,7 @@
               </w:rPr>
               <w:t>weight_decay</w:t>
             </w:r>
+            <w:proofErr w:type="spellEnd"/>
           </w:p>
         </w:tc>
         <w:tc>
@@ -4777,6 +4861,7 @@
                 <w:szCs w:val="24"/>
               </w:rPr>
             </w:pPr>
+            <w:proofErr w:type="spellStart"/>
             <w:r>
               <w:rPr>
                 <w:rFonts w:ascii="Times New Roman" w:eastAsia="SimSun" w:hAnsi="Times New Roman" w:cs="DengXian"/>
@@ -4786,6 +4871,7 @@
               </w:rPr>
               <w:t>batch_size</w:t>
             </w:r>
+            <w:proofErr w:type="spellEnd"/>
           </w:p>
         </w:tc>
         <w:tc>
@@ -4893,14 +4979,65 @@
                 <w:szCs w:val="24"/>
               </w:rPr>
             </w:pPr>
-            <w:r>
-              <w:rPr>
-                <w:rFonts w:ascii="Times New Roman" w:eastAsia="SimSun" w:hAnsi="Times New Roman" w:cs="DengXian"/>
-                <w:kern w:val="0"/>
-                <w:sz w:val="24"/>
-                <w:szCs w:val="24"/>
-              </w:rPr>
-              <w:t>rnn_hidden 128, hidden_dim 256, num_layers 1, bidirectional</w:t>
+            <w:proofErr w:type="spellStart"/>
+            <w:r>
+              <w:rPr>
+                <w:rFonts w:ascii="Times New Roman" w:eastAsia="SimSun" w:hAnsi="Times New Roman" w:cs="DengXian"/>
+                <w:kern w:val="0"/>
+                <w:sz w:val="24"/>
+                <w:szCs w:val="24"/>
+              </w:rPr>
+              <w:t>rnn_hidden</w:t>
+            </w:r>
+            <w:proofErr w:type="spellEnd"/>
+            <w:r>
+              <w:rPr>
+                <w:rFonts w:ascii="Times New Roman" w:eastAsia="SimSun" w:hAnsi="Times New Roman" w:cs="DengXian"/>
+                <w:kern w:val="0"/>
+                <w:sz w:val="24"/>
+                <w:szCs w:val="24"/>
+              </w:rPr>
+              <w:t xml:space="preserve"> 128, </w:t>
+            </w:r>
+            <w:proofErr w:type="spellStart"/>
+            <w:r>
+              <w:rPr>
+                <w:rFonts w:ascii="Times New Roman" w:eastAsia="SimSun" w:hAnsi="Times New Roman" w:cs="DengXian"/>
+                <w:kern w:val="0"/>
+                <w:sz w:val="24"/>
+                <w:szCs w:val="24"/>
+              </w:rPr>
+              <w:t>hidden_dim</w:t>
+            </w:r>
+            <w:proofErr w:type="spellEnd"/>
+            <w:r>
+              <w:rPr>
+                <w:rFonts w:ascii="Times New Roman" w:eastAsia="SimSun" w:hAnsi="Times New Roman" w:cs="DengXian"/>
+                <w:kern w:val="0"/>
+                <w:sz w:val="24"/>
+                <w:szCs w:val="24"/>
+              </w:rPr>
+              <w:t xml:space="preserve"> 256, </w:t>
+            </w:r>
+            <w:proofErr w:type="spellStart"/>
+            <w:r>
+              <w:rPr>
+                <w:rFonts w:ascii="Times New Roman" w:eastAsia="SimSun" w:hAnsi="Times New Roman" w:cs="DengXian"/>
+                <w:kern w:val="0"/>
+                <w:sz w:val="24"/>
+                <w:szCs w:val="24"/>
+              </w:rPr>
+              <w:t>num_layers</w:t>
+            </w:r>
+            <w:proofErr w:type="spellEnd"/>
+            <w:r>
+              <w:rPr>
+                <w:rFonts w:ascii="Times New Roman" w:eastAsia="SimSun" w:hAnsi="Times New Roman" w:cs="DengXian"/>
+                <w:kern w:val="0"/>
+                <w:sz w:val="24"/>
+                <w:szCs w:val="24"/>
+              </w:rPr>
+              <w:t xml:space="preserve"> 1, bidirectional</w:t>
             </w:r>
           </w:p>
         </w:tc>
@@ -5243,6 +5380,7 @@
           <w:szCs w:val="30"/>
         </w:rPr>
       </w:pPr>
+      <w:proofErr w:type="spellStart"/>
       <w:r>
         <w:rPr>
           <w:rFonts w:ascii="Times New Roman" w:eastAsia="SimSun" w:hAnsi="Times New Roman" w:cs="DengXian" w:hint="eastAsia"/>
@@ -5252,6 +5390,7 @@
         </w:rPr>
         <w:t>CNN+attention</w:t>
       </w:r>
+      <w:proofErr w:type="spellEnd"/>
     </w:p>
     <w:p>
       <w:pPr>
@@ -5387,6 +5526,7 @@
         </w:rPr>
         <w:t>：</w:t>
       </w:r>
+      <w:proofErr w:type="spellStart"/>
       <w:r>
         <w:rPr>
           <w:rFonts w:ascii="Times New Roman" w:eastAsia="SimSun" w:hAnsi="Times New Roman" w:cs="DengXian" w:hint="eastAsia"/>
@@ -5414,6 +5554,7 @@
         </w:rPr>
         <w:t>attention</w:t>
       </w:r>
+      <w:proofErr w:type="spellEnd"/>
       <w:r>
         <w:rPr>
           <w:rFonts w:ascii="Times New Roman" w:eastAsia="SimSun" w:hAnsi="Times New Roman" w:cs="DengXian" w:hint="eastAsia"/>
@@ -5934,6 +6075,7 @@
                 <w:szCs w:val="24"/>
               </w:rPr>
             </w:pPr>
+            <w:proofErr w:type="spellStart"/>
             <w:r>
               <w:rPr>
                 <w:rFonts w:ascii="Times New Roman" w:eastAsia="SimSun" w:hAnsi="Times New Roman" w:cs="DengXian" w:hint="eastAsia"/>
@@ -5943,6 +6085,7 @@
               </w:rPr>
               <w:t>CNN+attention</w:t>
             </w:r>
+            <w:proofErr w:type="spellEnd"/>
           </w:p>
         </w:tc>
       </w:tr>
@@ -5977,6 +6120,7 @@
                 <w:szCs w:val="24"/>
               </w:rPr>
             </w:pPr>
+            <w:proofErr w:type="spellStart"/>
             <w:r>
               <w:rPr>
                 <w:rFonts w:ascii="Times New Roman" w:eastAsia="SimSun" w:hAnsi="Times New Roman" w:cs="DengXian"/>
@@ -5988,6 +6132,7 @@
               </w:rPr>
               <w:t>val_acc</w:t>
             </w:r>
+            <w:proofErr w:type="spellEnd"/>
           </w:p>
         </w:tc>
         <w:tc>
@@ -6092,6 +6237,7 @@
                 <w:szCs w:val="24"/>
               </w:rPr>
             </w:pPr>
+            <w:proofErr w:type="spellStart"/>
             <w:r>
               <w:rPr>
                 <w:rFonts w:ascii="Times New Roman" w:eastAsia="SimSun" w:hAnsi="Times New Roman" w:cs="DengXian"/>
@@ -6102,6 +6248,7 @@
               <w:lastRenderedPageBreak/>
               <w:t>val_loss</w:t>
             </w:r>
+            <w:proofErr w:type="spellEnd"/>
           </w:p>
         </w:tc>
         <w:tc>
@@ -6177,6 +6324,7 @@
                 <w:szCs w:val="24"/>
               </w:rPr>
             </w:pPr>
+            <w:proofErr w:type="spellStart"/>
             <w:r>
               <w:rPr>
                 <w:rFonts w:ascii="Times New Roman" w:eastAsia="SimSun" w:hAnsi="Times New Roman" w:cs="DengXian"/>
@@ -6186,6 +6334,7 @@
               </w:rPr>
               <w:t>lr</w:t>
             </w:r>
+            <w:proofErr w:type="spellEnd"/>
           </w:p>
         </w:tc>
         <w:tc>
@@ -6298,6 +6447,7 @@
                 <w:szCs w:val="24"/>
               </w:rPr>
             </w:pPr>
+            <w:proofErr w:type="spellStart"/>
             <w:r>
               <w:rPr>
                 <w:rFonts w:ascii="Times New Roman" w:eastAsia="SimSun" w:hAnsi="Times New Roman" w:cs="DengXian"/>
@@ -6307,6 +6457,7 @@
               </w:rPr>
               <w:t>weight_decay</w:t>
             </w:r>
+            <w:proofErr w:type="spellEnd"/>
           </w:p>
         </w:tc>
         <w:tc>
@@ -6485,6 +6636,7 @@
                 <w:szCs w:val="24"/>
               </w:rPr>
             </w:pPr>
+            <w:proofErr w:type="spellStart"/>
             <w:r>
               <w:rPr>
                 <w:rFonts w:ascii="Times New Roman" w:eastAsia="SimSun" w:hAnsi="Times New Roman" w:cs="DengXian"/>
@@ -6494,6 +6646,7 @@
               </w:rPr>
               <w:t>batch_size</w:t>
             </w:r>
+            <w:proofErr w:type="spellEnd"/>
           </w:p>
         </w:tc>
         <w:tc>
@@ -6601,14 +6754,45 @@
                 <w:szCs w:val="24"/>
               </w:rPr>
             </w:pPr>
-            <w:r>
-              <w:rPr>
-                <w:rFonts w:ascii="Times New Roman" w:eastAsia="SimSun" w:hAnsi="Times New Roman" w:cs="DengXian"/>
-                <w:kern w:val="0"/>
-                <w:sz w:val="24"/>
-                <w:szCs w:val="24"/>
-              </w:rPr>
-              <w:t>base_width 64, fnn_hidden 128, layers (2,2,2,2)</w:t>
+            <w:proofErr w:type="spellStart"/>
+            <w:r>
+              <w:rPr>
+                <w:rFonts w:ascii="Times New Roman" w:eastAsia="SimSun" w:hAnsi="Times New Roman" w:cs="DengXian"/>
+                <w:kern w:val="0"/>
+                <w:sz w:val="24"/>
+                <w:szCs w:val="24"/>
+              </w:rPr>
+              <w:t>base_width</w:t>
+            </w:r>
+            <w:proofErr w:type="spellEnd"/>
+            <w:r>
+              <w:rPr>
+                <w:rFonts w:ascii="Times New Roman" w:eastAsia="SimSun" w:hAnsi="Times New Roman" w:cs="DengXian"/>
+                <w:kern w:val="0"/>
+                <w:sz w:val="24"/>
+                <w:szCs w:val="24"/>
+              </w:rPr>
+              <w:t xml:space="preserve"> 64, </w:t>
+            </w:r>
+            <w:proofErr w:type="spellStart"/>
+            <w:r>
+              <w:rPr>
+                <w:rFonts w:ascii="Times New Roman" w:eastAsia="SimSun" w:hAnsi="Times New Roman" w:cs="DengXian"/>
+                <w:kern w:val="0"/>
+                <w:sz w:val="24"/>
+                <w:szCs w:val="24"/>
+              </w:rPr>
+              <w:t>fnn_hidden</w:t>
+            </w:r>
+            <w:proofErr w:type="spellEnd"/>
+            <w:r>
+              <w:rPr>
+                <w:rFonts w:ascii="Times New Roman" w:eastAsia="SimSun" w:hAnsi="Times New Roman" w:cs="DengXian"/>
+                <w:kern w:val="0"/>
+                <w:sz w:val="24"/>
+                <w:szCs w:val="24"/>
+              </w:rPr>
+              <w:t xml:space="preserve"> 128, layers (2,2,2,2)</w:t>
             </w:r>
           </w:p>
         </w:tc>
@@ -6927,6 +7111,7 @@
         </w:rPr>
         <w:t>下图为</w:t>
       </w:r>
+      <w:proofErr w:type="spellStart"/>
       <w:r>
         <w:rPr>
           <w:rFonts w:ascii="Times New Roman" w:eastAsia="SimSun" w:hAnsi="Times New Roman" w:cs="DengXian" w:hint="eastAsia"/>
@@ -6936,6 +7121,7 @@
         </w:rPr>
         <w:t>CNN+attention</w:t>
       </w:r>
+      <w:proofErr w:type="spellEnd"/>
       <w:r>
         <w:rPr>
           <w:rFonts w:ascii="Times New Roman" w:eastAsia="SimSun" w:hAnsi="Times New Roman" w:cs="DengXian" w:hint="eastAsia"/>
@@ -7042,6 +7228,7 @@
         </w:rPr>
         <w:t>：</w:t>
       </w:r>
+      <w:proofErr w:type="spellStart"/>
       <w:r>
         <w:rPr>
           <w:rFonts w:ascii="Times New Roman" w:eastAsia="SimSun" w:hAnsi="Times New Roman" w:cs="DengXian" w:hint="eastAsia"/>
@@ -7051,6 +7238,7 @@
         </w:rPr>
         <w:t>CNN+attention</w:t>
       </w:r>
+      <w:proofErr w:type="spellEnd"/>
       <w:r>
         <w:rPr>
           <w:rFonts w:ascii="Times New Roman" w:eastAsia="SimSun" w:hAnsi="Times New Roman" w:cs="DengXian" w:hint="eastAsia"/>
@@ -7089,6 +7277,7 @@
           <w:szCs w:val="30"/>
         </w:rPr>
       </w:pPr>
+      <w:proofErr w:type="spellStart"/>
       <w:r>
         <w:rPr>
           <w:rFonts w:ascii="Times New Roman" w:eastAsia="SimSun" w:hAnsi="Times New Roman" w:cs="DengXian" w:hint="eastAsia"/>
@@ -7099,6 +7288,7 @@
         <w:lastRenderedPageBreak/>
         <w:t>ViT</w:t>
       </w:r>
+      <w:proofErr w:type="spellEnd"/>
     </w:p>
     <w:p>
       <w:pPr>
@@ -7112,6 +7302,7 @@
           <w:szCs w:val="24"/>
         </w:rPr>
       </w:pPr>
+      <w:proofErr w:type="spellStart"/>
       <w:r>
         <w:rPr>
           <w:rFonts w:ascii="Times New Roman" w:eastAsia="SimSun" w:hAnsi="Times New Roman" w:cs="DengXian" w:hint="eastAsia"/>
@@ -7121,6 +7312,7 @@
         </w:rPr>
         <w:t>ViT</w:t>
       </w:r>
+      <w:proofErr w:type="spellEnd"/>
       <w:r>
         <w:rPr>
           <w:rFonts w:ascii="Times New Roman" w:eastAsia="SimSun" w:hAnsi="Times New Roman" w:cs="DengXian" w:hint="eastAsia"/>
@@ -7184,6 +7376,7 @@
         </w:rPr>
         <w:t>步长”的处理类似。</w:t>
       </w:r>
+      <w:proofErr w:type="spellStart"/>
       <w:r>
         <w:rPr>
           <w:rFonts w:ascii="Times New Roman" w:eastAsia="SimSun" w:hAnsi="Times New Roman" w:cs="DengXian" w:hint="eastAsia"/>
@@ -7193,6 +7386,7 @@
         </w:rPr>
         <w:t>ViT</w:t>
       </w:r>
+      <w:proofErr w:type="spellEnd"/>
       <w:r>
         <w:rPr>
           <w:rFonts w:ascii="Times New Roman" w:eastAsia="SimSun" w:hAnsi="Times New Roman" w:cs="DengXian" w:hint="eastAsia"/>
@@ -7202,6 +7396,7 @@
         </w:rPr>
         <w:t>通过自注意力机制来聚合图片信息，与前面的</w:t>
       </w:r>
+      <w:proofErr w:type="spellStart"/>
       <w:r>
         <w:rPr>
           <w:rFonts w:ascii="Times New Roman" w:eastAsia="SimSun" w:hAnsi="Times New Roman" w:cs="DengXian" w:hint="eastAsia"/>
@@ -7211,6 +7406,7 @@
         </w:rPr>
         <w:t>CNN+attention</w:t>
       </w:r>
+      <w:proofErr w:type="spellEnd"/>
       <w:r>
         <w:rPr>
           <w:rFonts w:ascii="Times New Roman" w:eastAsia="SimSun" w:hAnsi="Times New Roman" w:cs="DengXian" w:hint="eastAsia"/>
@@ -7220,6 +7416,7 @@
         </w:rPr>
         <w:t>相比，</w:t>
       </w:r>
+      <w:proofErr w:type="spellStart"/>
       <w:r>
         <w:rPr>
           <w:rFonts w:ascii="Times New Roman" w:eastAsia="SimSun" w:hAnsi="Times New Roman" w:cs="DengXian" w:hint="eastAsia"/>
@@ -7229,6 +7426,7 @@
         </w:rPr>
         <w:t>ViT</w:t>
       </w:r>
+      <w:proofErr w:type="spellEnd"/>
       <w:r>
         <w:rPr>
           <w:rFonts w:ascii="Times New Roman" w:eastAsia="SimSun" w:hAnsi="Times New Roman" w:cs="DengXian" w:hint="eastAsia"/>
@@ -7389,6 +7587,7 @@
         </w:rPr>
         <w:t>：</w:t>
       </w:r>
+      <w:proofErr w:type="spellStart"/>
       <w:r>
         <w:rPr>
           <w:rFonts w:ascii="Times New Roman" w:eastAsia="SimSun" w:hAnsi="Times New Roman" w:cs="DengXian" w:hint="eastAsia"/>
@@ -7398,6 +7597,7 @@
         </w:rPr>
         <w:t>ViT</w:t>
       </w:r>
+      <w:proofErr w:type="spellEnd"/>
       <w:r>
         <w:rPr>
           <w:rFonts w:ascii="Times New Roman" w:eastAsia="SimSun" w:hAnsi="Times New Roman" w:cs="DengXian" w:hint="eastAsia"/>
@@ -7420,6 +7620,7 @@
           <w:szCs w:val="24"/>
         </w:rPr>
       </w:pPr>
+      <w:proofErr w:type="spellStart"/>
       <w:r>
         <w:rPr>
           <w:rFonts w:ascii="Times New Roman" w:eastAsia="SimSun" w:hAnsi="Times New Roman" w:cs="DengXian" w:hint="eastAsia"/>
@@ -7429,6 +7630,7 @@
         </w:rPr>
         <w:t>ViT</w:t>
       </w:r>
+      <w:proofErr w:type="spellEnd"/>
       <w:r>
         <w:rPr>
           <w:rFonts w:ascii="Times New Roman" w:eastAsia="SimSun" w:hAnsi="Times New Roman" w:cs="DengXian" w:hint="eastAsia"/>
@@ -7474,14 +7676,25 @@
         </w:rPr>
         <w:t>序列，随后初始化一个</w:t>
       </w:r>
-      <w:r>
-        <w:rPr>
-          <w:rFonts w:ascii="Times New Roman" w:eastAsia="SimSun" w:hAnsi="Times New Roman" w:cs="DengXian" w:hint="eastAsia"/>
-          <w:kern w:val="0"/>
-          <w:sz w:val="24"/>
-          <w:szCs w:val="24"/>
-        </w:rPr>
-        <w:t>cls token</w:t>
+      <w:proofErr w:type="spellStart"/>
+      <w:r>
+        <w:rPr>
+          <w:rFonts w:ascii="Times New Roman" w:eastAsia="SimSun" w:hAnsi="Times New Roman" w:cs="DengXian" w:hint="eastAsia"/>
+          <w:kern w:val="0"/>
+          <w:sz w:val="24"/>
+          <w:szCs w:val="24"/>
+        </w:rPr>
+        <w:t>cls</w:t>
+      </w:r>
+      <w:proofErr w:type="spellEnd"/>
+      <w:r>
+        <w:rPr>
+          <w:rFonts w:ascii="Times New Roman" w:eastAsia="SimSun" w:hAnsi="Times New Roman" w:cs="DengXian" w:hint="eastAsia"/>
+          <w:kern w:val="0"/>
+          <w:sz w:val="24"/>
+          <w:szCs w:val="24"/>
+        </w:rPr>
+        <w:t xml:space="preserve"> token</w:t>
       </w:r>
       <w:r>
         <w:rPr>
@@ -7744,14 +7957,25 @@
         </w:rPr>
         <w:t>都包含有全局信息，将</w:t>
       </w:r>
-      <w:r>
-        <w:rPr>
-          <w:rFonts w:ascii="Times New Roman" w:eastAsia="SimSun" w:hAnsi="Times New Roman" w:cs="DengXian" w:hint="eastAsia"/>
-          <w:kern w:val="0"/>
-          <w:sz w:val="24"/>
-          <w:szCs w:val="24"/>
-        </w:rPr>
-        <w:t>cls token</w:t>
+      <w:proofErr w:type="spellStart"/>
+      <w:r>
+        <w:rPr>
+          <w:rFonts w:ascii="Times New Roman" w:eastAsia="SimSun" w:hAnsi="Times New Roman" w:cs="DengXian" w:hint="eastAsia"/>
+          <w:kern w:val="0"/>
+          <w:sz w:val="24"/>
+          <w:szCs w:val="24"/>
+        </w:rPr>
+        <w:t>cls</w:t>
+      </w:r>
+      <w:proofErr w:type="spellEnd"/>
+      <w:r>
+        <w:rPr>
+          <w:rFonts w:ascii="Times New Roman" w:eastAsia="SimSun" w:hAnsi="Times New Roman" w:cs="DengXian" w:hint="eastAsia"/>
+          <w:kern w:val="0"/>
+          <w:sz w:val="24"/>
+          <w:szCs w:val="24"/>
+        </w:rPr>
+        <w:t xml:space="preserve"> token</w:t>
       </w:r>
       <w:r>
         <w:rPr>
@@ -7789,6 +8013,7 @@
         </w:rPr>
         <w:t>依赖降采样池化来扩大感受野相比，</w:t>
       </w:r>
+      <w:proofErr w:type="spellStart"/>
       <w:r>
         <w:rPr>
           <w:rFonts w:ascii="Times New Roman" w:eastAsia="SimSun" w:hAnsi="Times New Roman" w:cs="DengXian" w:hint="eastAsia"/>
@@ -7798,6 +8023,7 @@
         </w:rPr>
         <w:t>ViT</w:t>
       </w:r>
+      <w:proofErr w:type="spellEnd"/>
       <w:r>
         <w:rPr>
           <w:rFonts w:ascii="Times New Roman" w:eastAsia="SimSun" w:hAnsi="Times New Roman" w:cs="DengXian" w:hint="eastAsia"/>
@@ -7895,7 +8121,7 @@
           <w:sz w:val="24"/>
           <w:szCs w:val="24"/>
         </w:rPr>
-        <w:t>联系，全局信息聚合能力更强。</w:t>
+        <w:t>联系，全局信息聚合能力更强</w:t>
       </w:r>
     </w:p>
     <w:p>
@@ -7919,6 +8145,7 @@
         </w:rPr>
         <w:t>然而在实际训练过程中，由于数据集较小，</w:t>
       </w:r>
+      <w:proofErr w:type="spellStart"/>
       <w:r>
         <w:rPr>
           <w:rFonts w:ascii="Times New Roman" w:eastAsia="SimSun" w:hAnsi="Times New Roman" w:cs="DengXian" w:hint="eastAsia"/>
@@ -7928,6 +8155,7 @@
         </w:rPr>
         <w:t>ViT</w:t>
       </w:r>
+      <w:proofErr w:type="spellEnd"/>
       <w:r>
         <w:rPr>
           <w:rFonts w:ascii="Times New Roman" w:eastAsia="SimSun" w:hAnsi="Times New Roman" w:cs="DengXian" w:hint="eastAsia"/>
@@ -7973,14 +8201,25 @@
         </w:rPr>
         <w:t>仍在稳定下降，但</w:t>
       </w:r>
-      <w:r>
-        <w:rPr>
-          <w:rFonts w:ascii="Times New Roman" w:eastAsia="SimSun" w:hAnsi="Times New Roman" w:cs="DengXian" w:hint="eastAsia"/>
-          <w:kern w:val="0"/>
-          <w:sz w:val="24"/>
-          <w:szCs w:val="24"/>
-        </w:rPr>
-        <w:t>val loss</w:t>
+      <w:proofErr w:type="spellStart"/>
+      <w:r>
+        <w:rPr>
+          <w:rFonts w:ascii="Times New Roman" w:eastAsia="SimSun" w:hAnsi="Times New Roman" w:cs="DengXian" w:hint="eastAsia"/>
+          <w:kern w:val="0"/>
+          <w:sz w:val="24"/>
+          <w:szCs w:val="24"/>
+        </w:rPr>
+        <w:t>val</w:t>
+      </w:r>
+      <w:proofErr w:type="spellEnd"/>
+      <w:r>
+        <w:rPr>
+          <w:rFonts w:ascii="Times New Roman" w:eastAsia="SimSun" w:hAnsi="Times New Roman" w:cs="DengXian" w:hint="eastAsia"/>
+          <w:kern w:val="0"/>
+          <w:sz w:val="24"/>
+          <w:szCs w:val="24"/>
+        </w:rPr>
+        <w:t xml:space="preserve"> loss</w:t>
       </w:r>
       <w:r>
         <w:rPr>
@@ -8125,6 +8364,7 @@
         </w:rPr>
         <w:t>图十一：</w:t>
       </w:r>
+      <w:proofErr w:type="spellStart"/>
       <w:r>
         <w:rPr>
           <w:rFonts w:ascii="Times New Roman" w:eastAsia="SimSun" w:hAnsi="Times New Roman" w:cs="DengXian" w:hint="eastAsia"/>
@@ -8134,6 +8374,7 @@
         </w:rPr>
         <w:t>ViT</w:t>
       </w:r>
+      <w:proofErr w:type="spellEnd"/>
       <w:r>
         <w:rPr>
           <w:rFonts w:ascii="Times New Roman" w:eastAsia="SimSun" w:hAnsi="Times New Roman" w:cs="DengXian" w:hint="eastAsia"/>
@@ -8183,6 +8424,7 @@
         </w:rPr>
         <w:t>下表为</w:t>
       </w:r>
+      <w:proofErr w:type="spellStart"/>
       <w:r>
         <w:rPr>
           <w:rFonts w:ascii="Times New Roman" w:eastAsia="SimSun" w:hAnsi="Times New Roman" w:cs="DengXian" w:hint="eastAsia"/>
@@ -8192,6 +8434,7 @@
         </w:rPr>
         <w:t>ViT</w:t>
       </w:r>
+      <w:proofErr w:type="spellEnd"/>
       <w:r>
         <w:rPr>
           <w:rFonts w:ascii="Times New Roman" w:eastAsia="SimSun" w:hAnsi="Times New Roman" w:cs="DengXian" w:hint="eastAsia"/>
@@ -8219,6 +8462,7 @@
         </w:rPr>
         <w:t>。如图十二所示是</w:t>
       </w:r>
+      <w:proofErr w:type="spellStart"/>
       <w:r>
         <w:rPr>
           <w:rFonts w:ascii="Times New Roman" w:eastAsia="SimSun" w:hAnsi="Times New Roman" w:cs="DengXian" w:hint="eastAsia"/>
@@ -8228,6 +8472,7 @@
         </w:rPr>
         <w:t>ViT</w:t>
       </w:r>
+      <w:proofErr w:type="spellEnd"/>
       <w:r>
         <w:rPr>
           <w:rFonts w:ascii="Times New Roman" w:eastAsia="SimSun" w:hAnsi="Times New Roman" w:cs="DengXian" w:hint="eastAsia"/>
@@ -8326,6 +8571,7 @@
                 <w:szCs w:val="24"/>
               </w:rPr>
             </w:pPr>
+            <w:proofErr w:type="spellStart"/>
             <w:r>
               <w:rPr>
                 <w:rFonts w:ascii="Times New Roman" w:eastAsia="SimSun" w:hAnsi="Times New Roman" w:cs="DengXian" w:hint="eastAsia"/>
@@ -8335,6 +8581,7 @@
               </w:rPr>
               <w:t>ViT</w:t>
             </w:r>
+            <w:proofErr w:type="spellEnd"/>
           </w:p>
         </w:tc>
       </w:tr>
@@ -8369,6 +8616,7 @@
                 <w:szCs w:val="24"/>
               </w:rPr>
             </w:pPr>
+            <w:proofErr w:type="spellStart"/>
             <w:r>
               <w:rPr>
                 <w:rFonts w:ascii="Times New Roman" w:eastAsia="SimSun" w:hAnsi="Times New Roman" w:cs="DengXian"/>
@@ -8380,6 +8628,7 @@
               </w:rPr>
               <w:t>val_acc</w:t>
             </w:r>
+            <w:proofErr w:type="spellEnd"/>
           </w:p>
         </w:tc>
         <w:tc>
@@ -8484,6 +8733,7 @@
                 <w:szCs w:val="24"/>
               </w:rPr>
             </w:pPr>
+            <w:proofErr w:type="spellStart"/>
             <w:r>
               <w:rPr>
                 <w:rFonts w:ascii="Times New Roman" w:eastAsia="SimSun" w:hAnsi="Times New Roman" w:cs="DengXian"/>
@@ -8493,6 +8743,7 @@
               </w:rPr>
               <w:t>val_loss</w:t>
             </w:r>
+            <w:proofErr w:type="spellEnd"/>
           </w:p>
         </w:tc>
         <w:tc>
@@ -8568,6 +8819,7 @@
                 <w:szCs w:val="24"/>
               </w:rPr>
             </w:pPr>
+            <w:proofErr w:type="spellStart"/>
             <w:r>
               <w:rPr>
                 <w:rFonts w:ascii="Times New Roman" w:eastAsia="SimSun" w:hAnsi="Times New Roman" w:cs="DengXian"/>
@@ -8577,6 +8829,7 @@
               </w:rPr>
               <w:t>lr</w:t>
             </w:r>
+            <w:proofErr w:type="spellEnd"/>
           </w:p>
         </w:tc>
         <w:tc>
@@ -8667,6 +8920,7 @@
                 <w:szCs w:val="24"/>
               </w:rPr>
             </w:pPr>
+            <w:proofErr w:type="spellStart"/>
             <w:r>
               <w:rPr>
                 <w:rFonts w:ascii="Times New Roman" w:eastAsia="SimSun" w:hAnsi="Times New Roman" w:cs="DengXian"/>
@@ -8676,6 +8930,7 @@
               </w:rPr>
               <w:t>weight_decay</w:t>
             </w:r>
+            <w:proofErr w:type="spellEnd"/>
           </w:p>
         </w:tc>
         <w:tc>
@@ -8854,6 +9109,7 @@
                 <w:szCs w:val="24"/>
               </w:rPr>
             </w:pPr>
+            <w:proofErr w:type="spellStart"/>
             <w:r>
               <w:rPr>
                 <w:rFonts w:ascii="Times New Roman" w:eastAsia="SimSun" w:hAnsi="Times New Roman" w:cs="DengXian"/>
@@ -8863,6 +9119,7 @@
               </w:rPr>
               <w:t>batch_size</w:t>
             </w:r>
+            <w:proofErr w:type="spellEnd"/>
           </w:p>
         </w:tc>
         <w:tc>
@@ -8970,14 +9227,65 @@
                 <w:szCs w:val="24"/>
               </w:rPr>
             </w:pPr>
-            <w:r>
-              <w:rPr>
-                <w:rFonts w:ascii="Times New Roman" w:eastAsia="SimSun" w:hAnsi="Times New Roman" w:cs="DengXian"/>
-                <w:kern w:val="0"/>
-                <w:sz w:val="24"/>
-                <w:szCs w:val="24"/>
-              </w:rPr>
-              <w:t>embed_dim 128, depth 8, num_heads 4, patch_size 16</w:t>
+            <w:proofErr w:type="spellStart"/>
+            <w:r>
+              <w:rPr>
+                <w:rFonts w:ascii="Times New Roman" w:eastAsia="SimSun" w:hAnsi="Times New Roman" w:cs="DengXian"/>
+                <w:kern w:val="0"/>
+                <w:sz w:val="24"/>
+                <w:szCs w:val="24"/>
+              </w:rPr>
+              <w:t>embed_dim</w:t>
+            </w:r>
+            <w:proofErr w:type="spellEnd"/>
+            <w:r>
+              <w:rPr>
+                <w:rFonts w:ascii="Times New Roman" w:eastAsia="SimSun" w:hAnsi="Times New Roman" w:cs="DengXian"/>
+                <w:kern w:val="0"/>
+                <w:sz w:val="24"/>
+                <w:szCs w:val="24"/>
+              </w:rPr>
+              <w:t xml:space="preserve"> 128, depth 8, </w:t>
+            </w:r>
+            <w:proofErr w:type="spellStart"/>
+            <w:r>
+              <w:rPr>
+                <w:rFonts w:ascii="Times New Roman" w:eastAsia="SimSun" w:hAnsi="Times New Roman" w:cs="DengXian"/>
+                <w:kern w:val="0"/>
+                <w:sz w:val="24"/>
+                <w:szCs w:val="24"/>
+              </w:rPr>
+              <w:t>num_heads</w:t>
+            </w:r>
+            <w:proofErr w:type="spellEnd"/>
+            <w:r>
+              <w:rPr>
+                <w:rFonts w:ascii="Times New Roman" w:eastAsia="SimSun" w:hAnsi="Times New Roman" w:cs="DengXian"/>
+                <w:kern w:val="0"/>
+                <w:sz w:val="24"/>
+                <w:szCs w:val="24"/>
+              </w:rPr>
+              <w:t xml:space="preserve"> 4, </w:t>
+            </w:r>
+            <w:proofErr w:type="spellStart"/>
+            <w:r>
+              <w:rPr>
+                <w:rFonts w:ascii="Times New Roman" w:eastAsia="SimSun" w:hAnsi="Times New Roman" w:cs="DengXian"/>
+                <w:kern w:val="0"/>
+                <w:sz w:val="24"/>
+                <w:szCs w:val="24"/>
+              </w:rPr>
+              <w:t>patch_size</w:t>
+            </w:r>
+            <w:proofErr w:type="spellEnd"/>
+            <w:r>
+              <w:rPr>
+                <w:rFonts w:ascii="Times New Roman" w:eastAsia="SimSun" w:hAnsi="Times New Roman" w:cs="DengXian"/>
+                <w:kern w:val="0"/>
+                <w:sz w:val="24"/>
+                <w:szCs w:val="24"/>
+              </w:rPr>
+              <w:t xml:space="preserve"> 16</w:t>
             </w:r>
           </w:p>
         </w:tc>
@@ -9004,6 +9312,7 @@
         </w:rPr>
         <w:t>表五：</w:t>
       </w:r>
+      <w:proofErr w:type="spellStart"/>
       <w:r>
         <w:rPr>
           <w:rFonts w:ascii="Times New Roman" w:eastAsia="SimSun" w:hAnsi="Times New Roman" w:cs="DengXian" w:hint="eastAsia"/>
@@ -9013,6 +9322,7 @@
         </w:rPr>
         <w:t>ViT</w:t>
       </w:r>
+      <w:proofErr w:type="spellEnd"/>
       <w:r>
         <w:rPr>
           <w:rFonts w:ascii="Times New Roman" w:eastAsia="SimSun" w:hAnsi="Times New Roman" w:cs="DengXian" w:hint="eastAsia"/>
@@ -9120,6 +9430,7 @@
         </w:rPr>
         <w:t>：</w:t>
       </w:r>
+      <w:proofErr w:type="spellStart"/>
       <w:r>
         <w:rPr>
           <w:rFonts w:ascii="Times New Roman" w:eastAsia="SimSun" w:hAnsi="Times New Roman" w:cs="DengXian" w:hint="eastAsia"/>
@@ -9129,6 +9440,7 @@
         </w:rPr>
         <w:t>ViT</w:t>
       </w:r>
+      <w:proofErr w:type="spellEnd"/>
       <w:r>
         <w:rPr>
           <w:rFonts w:ascii="Times New Roman" w:eastAsia="SimSun" w:hAnsi="Times New Roman" w:cs="DengXian" w:hint="eastAsia"/>

</xml_diff>

<commit_message>
feat: final touches on docs
</commit_message>
<xml_diff>
--- a/docs/实验报告.docx
+++ b/docs/实验报告.docx
@@ -135,7 +135,6 @@
         </w:rPr>
         <w:t>三种模型架构，对</w:t>
       </w:r>
-      <w:proofErr w:type="spellStart"/>
       <w:r>
         <w:rPr>
           <w:rFonts w:ascii="Times New Roman" w:eastAsia="SimSun" w:hAnsi="Times New Roman" w:cs="DengXian" w:hint="eastAsia"/>
@@ -145,7 +144,6 @@
         </w:rPr>
         <w:t>kaggel</w:t>
       </w:r>
-      <w:proofErr w:type="spellEnd"/>
       <w:r>
         <w:rPr>
           <w:rFonts w:ascii="Times New Roman" w:eastAsia="SimSun" w:hAnsi="Times New Roman" w:cs="DengXian" w:hint="eastAsia"/>
@@ -155,17 +153,51 @@
         </w:rPr>
         <w:t>数据集中的猫狗图像进行分类。我使用</w:t>
       </w:r>
-      <w:proofErr w:type="spellStart"/>
-      <w:r>
-        <w:rPr>
-          <w:rFonts w:ascii="Times New Roman" w:eastAsia="SimSun" w:hAnsi="Times New Roman" w:cs="DengXian" w:hint="eastAsia"/>
-          <w:kern w:val="0"/>
-          <w:sz w:val="24"/>
-          <w:szCs w:val="24"/>
-        </w:rPr>
-        <w:t>pytorch</w:t>
-      </w:r>
-      <w:proofErr w:type="spellEnd"/>
+      <w:r>
+        <w:rPr>
+          <w:rFonts w:ascii="Times New Roman" w:eastAsia="SimSun" w:hAnsi="Times New Roman" w:cs="DengXian" w:hint="eastAsia"/>
+          <w:kern w:val="0"/>
+          <w:sz w:val="24"/>
+          <w:szCs w:val="24"/>
+        </w:rPr>
+        <w:t>P</w:t>
+      </w:r>
+      <w:r>
+        <w:rPr>
+          <w:rFonts w:ascii="Times New Roman" w:eastAsia="SimSun" w:hAnsi="Times New Roman" w:cs="DengXian" w:hint="eastAsia"/>
+          <w:kern w:val="0"/>
+          <w:sz w:val="24"/>
+          <w:szCs w:val="24"/>
+        </w:rPr>
+        <w:t>ytorch</w:t>
+      </w:r>
+      <w:r>
+        <w:rPr>
+          <w:rFonts w:ascii="Times New Roman" w:eastAsia="SimSun" w:hAnsi="Times New Roman" w:cs="DengXian" w:hint="eastAsia"/>
+          <w:kern w:val="0"/>
+          <w:sz w:val="24"/>
+          <w:szCs w:val="24"/>
+        </w:rPr>
+        <w:t xml:space="preserve"> </w:t>
+      </w:r>
+      <w:r>
+        <w:rPr>
+          <w:rFonts w:ascii="Times New Roman" w:eastAsia="SimSun" w:hAnsi="Times New Roman" w:cs="DengXian" w:hint="eastAsia"/>
+          <w:kern w:val="0"/>
+          <w:sz w:val="24"/>
+          <w:szCs w:val="24"/>
+        </w:rPr>
+        <w:t>L</w:t>
+      </w:r>
+      <w:r>
+        <w:rPr>
+          <w:rFonts w:ascii="Times New Roman" w:eastAsia="SimSun" w:hAnsi="Times New Roman" w:cs="DengXian" w:hint="eastAsia"/>
+          <w:kern w:val="0"/>
+          <w:sz w:val="24"/>
+          <w:szCs w:val="24"/>
+        </w:rPr>
+        <w:t>ightning</w:t>
+      </w:r>
       <w:r>
         <w:rPr>
           <w:rFonts w:ascii="Times New Roman" w:eastAsia="SimSun" w:hAnsi="Times New Roman" w:cs="DengXian" w:hint="eastAsia"/>
@@ -174,6 +206,622 @@
           <w:szCs w:val="24"/>
         </w:rPr>
         <w:t>框架实现了以上三种模型以及两个我因个人兴趣实现的模型，接下来我将逐个进行介绍。</w:t>
+      </w:r>
+    </w:p>
+    <w:p>
+      <w:pPr>
+        <w:spacing w:line="360" w:lineRule="auto"/>
+        <w:ind w:firstLine="420"/>
+        <w:jc w:val="left"/>
+        <w:rPr>
+          <w:rFonts w:ascii="Times New Roman" w:eastAsia="SimSun" w:hAnsi="Times New Roman" w:cs="DengXian" w:hint="eastAsia"/>
+          <w:kern w:val="0"/>
+          <w:sz w:val="24"/>
+          <w:szCs w:val="24"/>
+        </w:rPr>
+      </w:pPr>
+      <w:r>
+        <w:rPr>
+          <w:rFonts w:ascii="Times New Roman" w:eastAsia="SimSun" w:hAnsi="Times New Roman" w:cs="DengXian" w:hint="eastAsia"/>
+          <w:kern w:val="0"/>
+          <w:sz w:val="24"/>
+          <w:szCs w:val="24"/>
+        </w:rPr>
+        <w:t>项目地址：</w:t>
+      </w:r>
+      <w:r>
+        <w:rPr>
+          <w:rFonts w:ascii="Times New Roman" w:eastAsia="SimSun" w:hAnsi="Times New Roman" w:cs="DengXian"/>
+          <w:kern w:val="0"/>
+          <w:sz w:val="24"/>
+          <w:szCs w:val="24"/>
+        </w:rPr>
+        <w:t>https://github.com/Cartie-4/cat_dog_classification</w:t>
+      </w:r>
+    </w:p>
+    <w:p>
+      <w:pPr>
+        <w:spacing w:line="360" w:lineRule="auto"/>
+        <w:ind w:firstLine="420"/>
+        <w:jc w:val="left"/>
+        <w:rPr>
+          <w:rFonts w:ascii="Times New Roman" w:eastAsia="SimSun" w:hAnsi="Times New Roman" w:cs="DengXian"/>
+          <w:kern w:val="0"/>
+          <w:sz w:val="24"/>
+          <w:szCs w:val="24"/>
+        </w:rPr>
+      </w:pPr>
+      <w:r>
+        <w:rPr>
+          <w:rFonts w:ascii="Times New Roman" w:eastAsia="SimSun" w:hAnsi="Times New Roman" w:cs="DengXian" w:hint="eastAsia"/>
+          <w:kern w:val="0"/>
+          <w:sz w:val="24"/>
+          <w:szCs w:val="24"/>
+        </w:rPr>
+        <w:t>项目结构：</w:t>
+      </w:r>
+    </w:p>
+    <w:p>
+      <w:pPr>
+        <w:spacing w:line="360" w:lineRule="auto"/>
+        <w:ind w:firstLine="420"/>
+        <w:jc w:val="left"/>
+        <w:rPr>
+          <w:rFonts w:ascii="Times New Roman" w:eastAsia="SimSun" w:hAnsi="Times New Roman" w:cs="DengXian"/>
+          <w:kern w:val="0"/>
+          <w:sz w:val="24"/>
+          <w:szCs w:val="24"/>
+        </w:rPr>
+      </w:pPr>
+      <w:r>
+        <w:rPr>
+          <w:rFonts w:ascii="Times New Roman" w:eastAsia="SimSun" w:hAnsi="Times New Roman" w:cs="DengXian"/>
+          <w:kern w:val="0"/>
+          <w:sz w:val="24"/>
+          <w:szCs w:val="24"/>
+        </w:rPr>
+        <w:t>D</w:t>
+      </w:r>
+      <w:r>
+        <w:rPr>
+          <w:rFonts w:ascii="Times New Roman" w:eastAsia="SimSun" w:hAnsi="Times New Roman" w:cs="DengXian" w:hint="eastAsia"/>
+          <w:kern w:val="0"/>
+          <w:sz w:val="24"/>
+          <w:szCs w:val="24"/>
+        </w:rPr>
+        <w:t>ata/:</w:t>
+      </w:r>
+      <w:r>
+        <w:rPr>
+          <w:rFonts w:ascii="Times New Roman" w:eastAsia="SimSun" w:hAnsi="Times New Roman" w:cs="DengXian" w:hint="eastAsia"/>
+          <w:kern w:val="0"/>
+          <w:sz w:val="24"/>
+          <w:szCs w:val="24"/>
+        </w:rPr>
+        <w:t>图片数据集，包含</w:t>
+      </w:r>
+      <w:r>
+        <w:rPr>
+          <w:rFonts w:ascii="Times New Roman" w:eastAsia="SimSun" w:hAnsi="Times New Roman" w:cs="DengXian" w:hint="eastAsia"/>
+          <w:kern w:val="0"/>
+          <w:sz w:val="24"/>
+          <w:szCs w:val="24"/>
+        </w:rPr>
+        <w:t>train/2000</w:t>
+      </w:r>
+      <w:r>
+        <w:rPr>
+          <w:rFonts w:ascii="Times New Roman" w:eastAsia="SimSun" w:hAnsi="Times New Roman" w:cs="DengXian" w:hint="eastAsia"/>
+          <w:kern w:val="0"/>
+          <w:sz w:val="24"/>
+          <w:szCs w:val="24"/>
+        </w:rPr>
+        <w:t>张训练样本和</w:t>
+      </w:r>
+      <w:r>
+        <w:rPr>
+          <w:rFonts w:ascii="Times New Roman" w:eastAsia="SimSun" w:hAnsi="Times New Roman" w:cs="DengXian" w:hint="eastAsia"/>
+          <w:kern w:val="0"/>
+          <w:sz w:val="24"/>
+          <w:szCs w:val="24"/>
+        </w:rPr>
+        <w:t>val/500</w:t>
+      </w:r>
+      <w:r>
+        <w:rPr>
+          <w:rFonts w:ascii="Times New Roman" w:eastAsia="SimSun" w:hAnsi="Times New Roman" w:cs="DengXian" w:hint="eastAsia"/>
+          <w:kern w:val="0"/>
+          <w:sz w:val="24"/>
+          <w:szCs w:val="24"/>
+        </w:rPr>
+        <w:t>张验证样本</w:t>
+      </w:r>
+    </w:p>
+    <w:p>
+      <w:pPr>
+        <w:spacing w:line="360" w:lineRule="auto"/>
+        <w:ind w:firstLine="420"/>
+        <w:jc w:val="left"/>
+        <w:rPr>
+          <w:rFonts w:ascii="Times New Roman" w:eastAsia="SimSun" w:hAnsi="Times New Roman" w:cs="DengXian" w:hint="eastAsia"/>
+          <w:kern w:val="0"/>
+          <w:sz w:val="24"/>
+          <w:szCs w:val="24"/>
+        </w:rPr>
+      </w:pPr>
+      <w:r>
+        <w:rPr>
+          <w:rFonts w:ascii="Times New Roman" w:eastAsia="SimSun" w:hAnsi="Times New Roman" w:cs="DengXian"/>
+          <w:kern w:val="0"/>
+          <w:sz w:val="24"/>
+          <w:szCs w:val="24"/>
+        </w:rPr>
+        <w:t>S</w:t>
+      </w:r>
+      <w:r>
+        <w:rPr>
+          <w:rFonts w:ascii="Times New Roman" w:eastAsia="SimSun" w:hAnsi="Times New Roman" w:cs="DengXian" w:hint="eastAsia"/>
+          <w:kern w:val="0"/>
+          <w:sz w:val="24"/>
+          <w:szCs w:val="24"/>
+        </w:rPr>
+        <w:t>rc/catdog/:</w:t>
+      </w:r>
+      <w:r>
+        <w:rPr>
+          <w:rFonts w:ascii="Times New Roman" w:eastAsia="SimSun" w:hAnsi="Times New Roman" w:cs="DengXian" w:hint="eastAsia"/>
+          <w:kern w:val="0"/>
+          <w:sz w:val="24"/>
+          <w:szCs w:val="24"/>
+        </w:rPr>
+        <w:t>项目核心库</w:t>
+      </w:r>
+      <w:r>
+        <w:rPr>
+          <w:rFonts w:ascii="Times New Roman" w:eastAsia="SimSun" w:hAnsi="Times New Roman" w:cs="DengXian" w:hint="eastAsia"/>
+          <w:kern w:val="0"/>
+          <w:sz w:val="24"/>
+          <w:szCs w:val="24"/>
+        </w:rPr>
+        <w:t>，可作为</w:t>
+      </w:r>
+      <w:r>
+        <w:rPr>
+          <w:rFonts w:ascii="Times New Roman" w:eastAsia="SimSun" w:hAnsi="Times New Roman" w:cs="DengXian" w:hint="eastAsia"/>
+          <w:kern w:val="0"/>
+          <w:sz w:val="24"/>
+          <w:szCs w:val="24"/>
+        </w:rPr>
+        <w:t>python</w:t>
+      </w:r>
+      <w:r>
+        <w:rPr>
+          <w:rFonts w:ascii="Times New Roman" w:eastAsia="SimSun" w:hAnsi="Times New Roman" w:cs="DengXian" w:hint="eastAsia"/>
+          <w:kern w:val="0"/>
+          <w:sz w:val="24"/>
+          <w:szCs w:val="24"/>
+        </w:rPr>
+        <w:t>库安装</w:t>
+      </w:r>
+    </w:p>
+    <w:p>
+      <w:pPr>
+        <w:spacing w:line="360" w:lineRule="auto"/>
+        <w:ind w:firstLine="420"/>
+        <w:jc w:val="left"/>
+        <w:rPr>
+          <w:rFonts w:ascii="Times New Roman" w:eastAsia="SimSun" w:hAnsi="Times New Roman" w:cs="DengXian" w:hint="eastAsia"/>
+          <w:kern w:val="0"/>
+          <w:sz w:val="24"/>
+          <w:szCs w:val="24"/>
+        </w:rPr>
+      </w:pPr>
+      <w:r>
+        <w:rPr>
+          <w:rFonts w:ascii="Times New Roman" w:eastAsia="SimSun" w:hAnsi="Times New Roman" w:cs="DengXian"/>
+          <w:kern w:val="0"/>
+          <w:sz w:val="24"/>
+          <w:szCs w:val="24"/>
+        </w:rPr>
+        <w:tab/>
+      </w:r>
+      <w:r>
+        <w:rPr>
+          <w:rFonts w:ascii="Times New Roman" w:eastAsia="SimSun" w:hAnsi="Times New Roman" w:cs="DengXian" w:hint="eastAsia"/>
+          <w:kern w:val="0"/>
+          <w:sz w:val="24"/>
+          <w:szCs w:val="24"/>
+        </w:rPr>
+        <w:t>| -&gt;data/:transforms</w:t>
+      </w:r>
+      <w:r>
+        <w:rPr>
+          <w:rFonts w:ascii="Times New Roman" w:eastAsia="SimSun" w:hAnsi="Times New Roman" w:cs="DengXian" w:hint="eastAsia"/>
+          <w:kern w:val="0"/>
+          <w:sz w:val="24"/>
+          <w:szCs w:val="24"/>
+        </w:rPr>
+        <w:t>与</w:t>
+      </w:r>
+      <w:r>
+        <w:rPr>
+          <w:rFonts w:ascii="Times New Roman" w:eastAsia="SimSun" w:hAnsi="Times New Roman" w:cs="DengXian" w:hint="eastAsia"/>
+          <w:kern w:val="0"/>
+          <w:sz w:val="24"/>
+          <w:szCs w:val="24"/>
+        </w:rPr>
+        <w:t>data module</w:t>
+      </w:r>
+      <w:r>
+        <w:rPr>
+          <w:rFonts w:ascii="Times New Roman" w:eastAsia="SimSun" w:hAnsi="Times New Roman" w:cs="DengXian" w:hint="eastAsia"/>
+          <w:kern w:val="0"/>
+          <w:sz w:val="24"/>
+          <w:szCs w:val="24"/>
+        </w:rPr>
+        <w:t>，用于数据加载与预处理</w:t>
+      </w:r>
+    </w:p>
+    <w:p>
+      <w:pPr>
+        <w:spacing w:line="360" w:lineRule="auto"/>
+        <w:ind w:firstLine="420"/>
+        <w:jc w:val="left"/>
+        <w:rPr>
+          <w:rFonts w:ascii="Times New Roman" w:eastAsia="SimSun" w:hAnsi="Times New Roman" w:cs="DengXian" w:hint="eastAsia"/>
+          <w:kern w:val="0"/>
+          <w:sz w:val="24"/>
+          <w:szCs w:val="24"/>
+        </w:rPr>
+      </w:pPr>
+      <w:r>
+        <w:rPr>
+          <w:rFonts w:ascii="Times New Roman" w:eastAsia="SimSun" w:hAnsi="Times New Roman" w:cs="DengXian"/>
+          <w:kern w:val="0"/>
+          <w:sz w:val="24"/>
+          <w:szCs w:val="24"/>
+        </w:rPr>
+        <w:tab/>
+      </w:r>
+      <w:r>
+        <w:rPr>
+          <w:rFonts w:ascii="Times New Roman" w:eastAsia="SimSun" w:hAnsi="Times New Roman" w:cs="DengXian" w:hint="eastAsia"/>
+          <w:kern w:val="0"/>
+          <w:sz w:val="24"/>
+          <w:szCs w:val="24"/>
+        </w:rPr>
+        <w:t>|-&gt;models/:</w:t>
+      </w:r>
+      <w:r>
+        <w:rPr>
+          <w:rFonts w:ascii="Times New Roman" w:eastAsia="SimSun" w:hAnsi="Times New Roman" w:cs="DengXian" w:hint="eastAsia"/>
+          <w:kern w:val="0"/>
+          <w:sz w:val="24"/>
+          <w:szCs w:val="24"/>
+        </w:rPr>
+        <w:t>模型实现，包含</w:t>
+      </w:r>
+      <w:r>
+        <w:rPr>
+          <w:rFonts w:ascii="Times New Roman" w:eastAsia="SimSun" w:hAnsi="Times New Roman" w:cs="DengXian" w:hint="eastAsia"/>
+          <w:kern w:val="0"/>
+          <w:sz w:val="24"/>
+          <w:szCs w:val="24"/>
+        </w:rPr>
+        <w:t>DNN</w:t>
+      </w:r>
+      <w:r>
+        <w:rPr>
+          <w:rFonts w:ascii="Times New Roman" w:eastAsia="SimSun" w:hAnsi="Times New Roman" w:cs="DengXian" w:hint="eastAsia"/>
+          <w:kern w:val="0"/>
+          <w:sz w:val="24"/>
+          <w:szCs w:val="24"/>
+        </w:rPr>
+        <w:t>、</w:t>
+      </w:r>
+      <w:r>
+        <w:rPr>
+          <w:rFonts w:ascii="Times New Roman" w:eastAsia="SimSun" w:hAnsi="Times New Roman" w:cs="DengXian" w:hint="eastAsia"/>
+          <w:kern w:val="0"/>
+          <w:sz w:val="24"/>
+          <w:szCs w:val="24"/>
+        </w:rPr>
+        <w:t>CNN</w:t>
+      </w:r>
+      <w:r>
+        <w:rPr>
+          <w:rFonts w:ascii="Times New Roman" w:eastAsia="SimSun" w:hAnsi="Times New Roman" w:cs="DengXian" w:hint="eastAsia"/>
+          <w:kern w:val="0"/>
+          <w:sz w:val="24"/>
+          <w:szCs w:val="24"/>
+        </w:rPr>
+        <w:t>、</w:t>
+      </w:r>
+      <w:r>
+        <w:rPr>
+          <w:rFonts w:ascii="Times New Roman" w:eastAsia="SimSun" w:hAnsi="Times New Roman" w:cs="DengXian" w:hint="eastAsia"/>
+          <w:kern w:val="0"/>
+          <w:sz w:val="24"/>
+          <w:szCs w:val="24"/>
+        </w:rPr>
+        <w:t>RNN</w:t>
+      </w:r>
+      <w:r>
+        <w:rPr>
+          <w:rFonts w:ascii="Times New Roman" w:eastAsia="SimSun" w:hAnsi="Times New Roman" w:cs="DengXian" w:hint="eastAsia"/>
+          <w:kern w:val="0"/>
+          <w:sz w:val="24"/>
+          <w:szCs w:val="24"/>
+        </w:rPr>
+        <w:t>、</w:t>
+      </w:r>
+      <w:r>
+        <w:rPr>
+          <w:rFonts w:ascii="Times New Roman" w:eastAsia="SimSun" w:hAnsi="Times New Roman" w:cs="DengXian" w:hint="eastAsia"/>
+          <w:kern w:val="0"/>
+          <w:sz w:val="24"/>
+          <w:szCs w:val="24"/>
+        </w:rPr>
+        <w:t>CNN+attention</w:t>
+      </w:r>
+      <w:r>
+        <w:rPr>
+          <w:rFonts w:ascii="Times New Roman" w:eastAsia="SimSun" w:hAnsi="Times New Roman" w:cs="DengXian" w:hint="eastAsia"/>
+          <w:kern w:val="0"/>
+          <w:sz w:val="24"/>
+          <w:szCs w:val="24"/>
+        </w:rPr>
+        <w:t>、</w:t>
+      </w:r>
+      <w:r>
+        <w:rPr>
+          <w:rFonts w:ascii="Times New Roman" w:eastAsia="SimSun" w:hAnsi="Times New Roman" w:cs="DengXian" w:hint="eastAsia"/>
+          <w:kern w:val="0"/>
+          <w:sz w:val="24"/>
+          <w:szCs w:val="24"/>
+        </w:rPr>
+        <w:t>ViT</w:t>
+      </w:r>
+    </w:p>
+    <w:p>
+      <w:pPr>
+        <w:spacing w:line="360" w:lineRule="auto"/>
+        <w:ind w:firstLine="420"/>
+        <w:jc w:val="left"/>
+        <w:rPr>
+          <w:rFonts w:ascii="Times New Roman" w:eastAsia="SimSun" w:hAnsi="Times New Roman" w:cs="DengXian" w:hint="eastAsia"/>
+          <w:kern w:val="0"/>
+          <w:sz w:val="24"/>
+          <w:szCs w:val="24"/>
+        </w:rPr>
+      </w:pPr>
+      <w:r>
+        <w:rPr>
+          <w:rFonts w:ascii="Times New Roman" w:eastAsia="SimSun" w:hAnsi="Times New Roman" w:cs="DengXian"/>
+          <w:kern w:val="0"/>
+          <w:sz w:val="24"/>
+          <w:szCs w:val="24"/>
+        </w:rPr>
+        <w:tab/>
+      </w:r>
+      <w:r>
+        <w:rPr>
+          <w:rFonts w:ascii="Times New Roman" w:eastAsia="SimSun" w:hAnsi="Times New Roman" w:cs="DengXian" w:hint="eastAsia"/>
+          <w:kern w:val="0"/>
+          <w:sz w:val="24"/>
+          <w:szCs w:val="24"/>
+        </w:rPr>
+        <w:t>|-&gt;train</w:t>
+      </w:r>
+      <w:r>
+        <w:rPr>
+          <w:rFonts w:ascii="Times New Roman" w:eastAsia="SimSun" w:hAnsi="Times New Roman" w:cs="DengXian" w:hint="eastAsia"/>
+          <w:kern w:val="0"/>
+          <w:sz w:val="24"/>
+          <w:szCs w:val="24"/>
+        </w:rPr>
+        <w:t>、</w:t>
+      </w:r>
+      <w:r>
+        <w:rPr>
+          <w:rFonts w:ascii="Times New Roman" w:eastAsia="SimSun" w:hAnsi="Times New Roman" w:cs="DengXian" w:hint="eastAsia"/>
+          <w:kern w:val="0"/>
+          <w:sz w:val="24"/>
+          <w:szCs w:val="24"/>
+        </w:rPr>
+        <w:t>evaluate</w:t>
+      </w:r>
+      <w:r>
+        <w:rPr>
+          <w:rFonts w:ascii="Times New Roman" w:eastAsia="SimSun" w:hAnsi="Times New Roman" w:cs="DengXian" w:hint="eastAsia"/>
+          <w:kern w:val="0"/>
+          <w:sz w:val="24"/>
+          <w:szCs w:val="24"/>
+        </w:rPr>
+        <w:t>、</w:t>
+      </w:r>
+      <w:r>
+        <w:rPr>
+          <w:rFonts w:ascii="Times New Roman" w:eastAsia="SimSun" w:hAnsi="Times New Roman" w:cs="DengXian" w:hint="eastAsia"/>
+          <w:kern w:val="0"/>
+          <w:sz w:val="24"/>
+          <w:szCs w:val="24"/>
+        </w:rPr>
+        <w:t>tune</w:t>
+      </w:r>
+      <w:r>
+        <w:rPr>
+          <w:rFonts w:ascii="Times New Roman" w:eastAsia="SimSun" w:hAnsi="Times New Roman" w:cs="DengXian" w:hint="eastAsia"/>
+          <w:kern w:val="0"/>
+          <w:sz w:val="24"/>
+          <w:szCs w:val="24"/>
+        </w:rPr>
+        <w:t>脚本</w:t>
+      </w:r>
+      <w:r>
+        <w:rPr>
+          <w:rFonts w:ascii="Times New Roman" w:eastAsia="SimSun" w:hAnsi="Times New Roman" w:cs="DengXian" w:hint="eastAsia"/>
+          <w:kern w:val="0"/>
+          <w:sz w:val="24"/>
+          <w:szCs w:val="24"/>
+        </w:rPr>
+        <w:t>:</w:t>
+      </w:r>
+      <w:r>
+        <w:rPr>
+          <w:rFonts w:ascii="Times New Roman" w:eastAsia="SimSun" w:hAnsi="Times New Roman" w:cs="DengXian" w:hint="eastAsia"/>
+          <w:kern w:val="0"/>
+          <w:sz w:val="24"/>
+          <w:szCs w:val="24"/>
+        </w:rPr>
+        <w:t>训练、验证、调参脚本</w:t>
+      </w:r>
+    </w:p>
+    <w:p>
+      <w:pPr>
+        <w:spacing w:line="360" w:lineRule="auto"/>
+        <w:ind w:firstLine="420"/>
+        <w:jc w:val="left"/>
+        <w:rPr>
+          <w:rFonts w:ascii="Times New Roman" w:eastAsia="SimSun" w:hAnsi="Times New Roman" w:cs="DengXian"/>
+          <w:kern w:val="0"/>
+          <w:sz w:val="24"/>
+          <w:szCs w:val="24"/>
+        </w:rPr>
+      </w:pPr>
+      <w:r>
+        <w:rPr>
+          <w:rFonts w:ascii="Times New Roman" w:eastAsia="SimSun" w:hAnsi="Times New Roman" w:cs="DengXian"/>
+          <w:kern w:val="0"/>
+          <w:sz w:val="24"/>
+          <w:szCs w:val="24"/>
+        </w:rPr>
+        <w:t>T</w:t>
+      </w:r>
+      <w:r>
+        <w:rPr>
+          <w:rFonts w:ascii="Times New Roman" w:eastAsia="SimSun" w:hAnsi="Times New Roman" w:cs="DengXian" w:hint="eastAsia"/>
+          <w:kern w:val="0"/>
+          <w:sz w:val="24"/>
+          <w:szCs w:val="24"/>
+        </w:rPr>
+        <w:t>ools/:</w:t>
+      </w:r>
+      <w:r>
+        <w:rPr>
+          <w:rFonts w:ascii="Times New Roman" w:eastAsia="SimSun" w:hAnsi="Times New Roman" w:cs="DengXian" w:hint="eastAsia"/>
+          <w:kern w:val="0"/>
+          <w:sz w:val="24"/>
+          <w:szCs w:val="24"/>
+        </w:rPr>
+        <w:t>离线分析脚本，详见</w:t>
+      </w:r>
+      <w:r>
+        <w:rPr>
+          <w:rFonts w:ascii="Times New Roman" w:eastAsia="SimSun" w:hAnsi="Times New Roman" w:cs="DengXian" w:hint="eastAsia"/>
+          <w:kern w:val="0"/>
+          <w:sz w:val="24"/>
+          <w:szCs w:val="24"/>
+        </w:rPr>
+        <w:t>README.md</w:t>
+      </w:r>
+    </w:p>
+    <w:p>
+      <w:pPr>
+        <w:spacing w:line="360" w:lineRule="auto"/>
+        <w:ind w:firstLine="420"/>
+        <w:jc w:val="left"/>
+        <w:rPr>
+          <w:rFonts w:ascii="Times New Roman" w:eastAsia="SimSun" w:hAnsi="Times New Roman" w:cs="DengXian"/>
+          <w:kern w:val="0"/>
+          <w:sz w:val="24"/>
+          <w:szCs w:val="24"/>
+        </w:rPr>
+      </w:pPr>
+      <w:r>
+        <w:rPr>
+          <w:rFonts w:ascii="Times New Roman" w:eastAsia="SimSun" w:hAnsi="Times New Roman" w:cs="DengXian"/>
+          <w:kern w:val="0"/>
+          <w:sz w:val="24"/>
+          <w:szCs w:val="24"/>
+        </w:rPr>
+        <w:t>D</w:t>
+      </w:r>
+      <w:r>
+        <w:rPr>
+          <w:rFonts w:ascii="Times New Roman" w:eastAsia="SimSun" w:hAnsi="Times New Roman" w:cs="DengXian" w:hint="eastAsia"/>
+          <w:kern w:val="0"/>
+          <w:sz w:val="24"/>
+          <w:szCs w:val="24"/>
+        </w:rPr>
+        <w:t>ocs/:</w:t>
+      </w:r>
+      <w:r>
+        <w:rPr>
+          <w:rFonts w:ascii="Times New Roman" w:eastAsia="SimSun" w:hAnsi="Times New Roman" w:cs="DengXian" w:hint="eastAsia"/>
+          <w:kern w:val="0"/>
+          <w:sz w:val="24"/>
+          <w:szCs w:val="24"/>
+        </w:rPr>
+        <w:t>文档目录，包含实验报告、超参搜索结果表和模型结构示意图</w:t>
+      </w:r>
+    </w:p>
+    <w:p>
+      <w:pPr>
+        <w:spacing w:line="360" w:lineRule="auto"/>
+        <w:ind w:firstLine="420"/>
+        <w:jc w:val="left"/>
+        <w:rPr>
+          <w:rFonts w:ascii="Times New Roman" w:eastAsia="SimSun" w:hAnsi="Times New Roman" w:cs="DengXian" w:hint="eastAsia"/>
+          <w:kern w:val="0"/>
+          <w:sz w:val="24"/>
+          <w:szCs w:val="24"/>
+        </w:rPr>
+      </w:pPr>
+      <w:r>
+        <w:rPr>
+          <w:rFonts w:ascii="Times New Roman" w:eastAsia="SimSun" w:hAnsi="Times New Roman" w:cs="DengXian"/>
+          <w:kern w:val="0"/>
+          <w:sz w:val="24"/>
+          <w:szCs w:val="24"/>
+        </w:rPr>
+        <w:t>O</w:t>
+      </w:r>
+      <w:r>
+        <w:rPr>
+          <w:rFonts w:ascii="Times New Roman" w:eastAsia="SimSun" w:hAnsi="Times New Roman" w:cs="DengXian" w:hint="eastAsia"/>
+          <w:kern w:val="0"/>
+          <w:sz w:val="24"/>
+          <w:szCs w:val="24"/>
+        </w:rPr>
+        <w:t>utputs/:</w:t>
+      </w:r>
+      <w:r>
+        <w:rPr>
+          <w:rFonts w:ascii="Times New Roman" w:eastAsia="SimSun" w:hAnsi="Times New Roman" w:cs="DengXian" w:hint="eastAsia"/>
+          <w:kern w:val="0"/>
+          <w:sz w:val="24"/>
+          <w:szCs w:val="24"/>
+        </w:rPr>
+        <w:t>运行产物，包含权重</w:t>
+      </w:r>
+      <w:r>
+        <w:rPr>
+          <w:rFonts w:ascii="Times New Roman" w:eastAsia="SimSun" w:hAnsi="Times New Roman" w:cs="DengXian" w:hint="eastAsia"/>
+          <w:kern w:val="0"/>
+          <w:sz w:val="24"/>
+          <w:szCs w:val="24"/>
+        </w:rPr>
+        <w:t>.ckpt</w:t>
+      </w:r>
+      <w:r>
+        <w:rPr>
+          <w:rFonts w:ascii="Times New Roman" w:eastAsia="SimSun" w:hAnsi="Times New Roman" w:cs="DengXian" w:hint="eastAsia"/>
+          <w:kern w:val="0"/>
+          <w:sz w:val="24"/>
+          <w:szCs w:val="24"/>
+        </w:rPr>
+        <w:t>文件、评估结果</w:t>
       </w:r>
     </w:p>
     <w:p>
@@ -256,6 +904,7 @@
         <w:rPr>
           <w:noProof/>
         </w:rPr>
+        <w:lastRenderedPageBreak/>
         <w:drawing>
           <wp:inline distT="0" distB="0" distL="0" distR="0" wp14:anchorId="5EE557BE" wp14:editId="3F09162D">
             <wp:extent cx="4590640" cy="4873625"/>
@@ -272,7 +921,7 @@
                     <pic:cNvPicPr/>
                   </pic:nvPicPr>
                   <pic:blipFill>
-                    <a:blip r:embed="rId6">
+                    <a:blip r:embed="rId8">
                       <a:extLst>
                         <a:ext uri="{28A0092B-C50C-407E-A947-70E740481C1C}">
                           <a14:useLocalDpi xmlns:a14="http://schemas.microsoft.com/office/drawing/2010/main" val="0"/>
@@ -339,7 +988,25 @@
           <w:sz w:val="24"/>
           <w:szCs w:val="24"/>
         </w:rPr>
-        <w:t>如图所示，我进行了两个不同链路的数据预处理</w:t>
+        <w:t>如图所示，我</w:t>
+      </w:r>
+      <w:r>
+        <w:rPr>
+          <w:rFonts w:ascii="Times New Roman" w:eastAsia="SimSun" w:hAnsi="Times New Roman" w:cs="DengXian" w:hint="eastAsia"/>
+          <w:kern w:val="0"/>
+          <w:sz w:val="24"/>
+          <w:szCs w:val="24"/>
+        </w:rPr>
+        <w:t>设计</w:t>
+      </w:r>
+      <w:r>
+        <w:rPr>
+          <w:rFonts w:ascii="Times New Roman" w:eastAsia="SimSun" w:hAnsi="Times New Roman" w:cs="DengXian" w:hint="eastAsia"/>
+          <w:kern w:val="0"/>
+          <w:sz w:val="24"/>
+          <w:szCs w:val="24"/>
+        </w:rPr>
+        <w:t>了两个不同链路的数据预处理</w:t>
       </w:r>
       <w:r>
         <w:rPr>
@@ -413,7 +1080,6 @@
         </w:rPr>
         <w:t>输出的是非固定尺寸的图像（用于进行</w:t>
       </w:r>
-      <w:proofErr w:type="spellStart"/>
       <w:r>
         <w:rPr>
           <w:rFonts w:ascii="Times New Roman" w:eastAsia="SimSun" w:hAnsi="Times New Roman" w:cs="DengXian" w:hint="eastAsia"/>
@@ -423,7 +1089,6 @@
         </w:rPr>
         <w:t>CNN+attention</w:t>
       </w:r>
-      <w:proofErr w:type="spellEnd"/>
       <w:r>
         <w:rPr>
           <w:rFonts w:ascii="Times New Roman" w:eastAsia="SimSun" w:hAnsi="Times New Roman" w:cs="DengXian" w:hint="eastAsia"/>
@@ -433,7 +1098,6 @@
         </w:rPr>
         <w:t>的训练，详见第六节：</w:t>
       </w:r>
-      <w:proofErr w:type="spellStart"/>
       <w:r>
         <w:rPr>
           <w:rFonts w:ascii="Times New Roman" w:eastAsia="SimSun" w:hAnsi="Times New Roman" w:cs="DengXian" w:hint="eastAsia"/>
@@ -443,7 +1107,6 @@
         </w:rPr>
         <w:t>CNN+attention</w:t>
       </w:r>
-      <w:proofErr w:type="spellEnd"/>
       <w:r>
         <w:rPr>
           <w:rFonts w:ascii="Times New Roman" w:eastAsia="SimSun" w:hAnsi="Times New Roman" w:cs="DengXian" w:hint="eastAsia"/>
@@ -481,7 +1144,6 @@
           <w:sz w:val="24"/>
           <w:szCs w:val="24"/>
         </w:rPr>
-        <w:lastRenderedPageBreak/>
         <w:t>对于输入的图像，</w:t>
       </w:r>
       <w:r>
@@ -740,7 +1402,17 @@
           <w:sz w:val="24"/>
           <w:szCs w:val="24"/>
         </w:rPr>
-        <w:t>中最大图像的大小，以便进行张量计算，注意这一步补</w:t>
+        <w:t>中最大</w:t>
+      </w:r>
+      <w:r>
+        <w:rPr>
+          <w:rFonts w:ascii="Times New Roman" w:eastAsia="SimSun" w:hAnsi="Times New Roman" w:cs="DengXian" w:hint="eastAsia"/>
+          <w:kern w:val="0"/>
+          <w:sz w:val="24"/>
+          <w:szCs w:val="24"/>
+        </w:rPr>
+        <w:lastRenderedPageBreak/>
+        <w:t>图像的大小，以便进行张量计算，注意这一步补</w:t>
       </w:r>
       <w:r>
         <w:rPr>
@@ -853,7 +1525,7 @@
                     <pic:cNvPicPr/>
                   </pic:nvPicPr>
                   <pic:blipFill>
-                    <a:blip r:embed="rId7">
+                    <a:blip r:embed="rId9">
                       <a:extLst>
                         <a:ext uri="{28A0092B-C50C-407E-A947-70E740481C1C}">
                           <a14:useLocalDpi xmlns:a14="http://schemas.microsoft.com/office/drawing/2010/main" val="0"/>
@@ -957,17 +1629,7 @@
           <w:sz w:val="24"/>
           <w:szCs w:val="24"/>
         </w:rPr>
-        <w:t>，通过多次加</w:t>
-      </w:r>
-      <w:r>
-        <w:rPr>
-          <w:rFonts w:ascii="Times New Roman" w:eastAsia="SimSun" w:hAnsi="Times New Roman" w:cs="DengXian" w:hint="eastAsia"/>
-          <w:kern w:val="0"/>
-          <w:sz w:val="24"/>
-          <w:szCs w:val="24"/>
-        </w:rPr>
-        <w:lastRenderedPageBreak/>
-        <w:t>权运算和非线性激活函数进行分类</w:t>
+        <w:t>，通过多次加权运算和非线性激活函数进行分类</w:t>
       </w:r>
       <w:r>
         <w:rPr>
@@ -1220,7 +1882,6 @@
                 <w:szCs w:val="24"/>
               </w:rPr>
             </w:pPr>
-            <w:proofErr w:type="spellStart"/>
             <w:r>
               <w:rPr>
                 <w:rFonts w:ascii="Times New Roman" w:eastAsia="SimSun" w:hAnsi="Times New Roman" w:cs="DengXian"/>
@@ -1232,7 +1893,6 @@
               </w:rPr>
               <w:t>val_acc</w:t>
             </w:r>
-            <w:proofErr w:type="spellEnd"/>
           </w:p>
         </w:tc>
         <w:tc>
@@ -1337,7 +1997,6 @@
                 <w:szCs w:val="24"/>
               </w:rPr>
             </w:pPr>
-            <w:proofErr w:type="spellStart"/>
             <w:r>
               <w:rPr>
                 <w:rFonts w:ascii="Times New Roman" w:eastAsia="SimSun" w:hAnsi="Times New Roman" w:cs="DengXian"/>
@@ -1347,7 +2006,6 @@
               </w:rPr>
               <w:t>val_loss</w:t>
             </w:r>
-            <w:proofErr w:type="spellEnd"/>
           </w:p>
         </w:tc>
         <w:tc>
@@ -1368,7 +2026,7 @@
               <w:ind w:firstLine="420"/>
               <w:jc w:val="center"/>
               <w:rPr>
-                <w:rFonts w:ascii="Times New Roman" w:eastAsia="SimSun" w:hAnsi="Times New Roman" w:cs="DengXian" w:hint="eastAsia"/>
+                <w:rFonts w:ascii="Times New Roman" w:eastAsia="SimSun" w:hAnsi="Times New Roman" w:cs="DengXian"/>
                 <w:kern w:val="0"/>
                 <w:sz w:val="24"/>
                 <w:szCs w:val="24"/>
@@ -1423,17 +2081,16 @@
                 <w:szCs w:val="24"/>
               </w:rPr>
             </w:pPr>
-            <w:proofErr w:type="spellStart"/>
-            <w:r>
-              <w:rPr>
-                <w:rFonts w:ascii="Times New Roman" w:eastAsia="SimSun" w:hAnsi="Times New Roman" w:cs="DengXian"/>
-                <w:kern w:val="0"/>
-                <w:sz w:val="24"/>
-                <w:szCs w:val="24"/>
-              </w:rPr>
+            <w:r>
+              <w:rPr>
+                <w:rFonts w:ascii="Times New Roman" w:eastAsia="SimSun" w:hAnsi="Times New Roman" w:cs="DengXian"/>
+                <w:kern w:val="0"/>
+                <w:sz w:val="24"/>
+                <w:szCs w:val="24"/>
+              </w:rPr>
+              <w:lastRenderedPageBreak/>
               <w:t>lr</w:t>
             </w:r>
-            <w:proofErr w:type="spellEnd"/>
           </w:p>
         </w:tc>
         <w:tc>
@@ -1502,7 +2159,6 @@
                 <w:szCs w:val="24"/>
               </w:rPr>
             </w:pPr>
-            <w:proofErr w:type="spellStart"/>
             <w:r>
               <w:rPr>
                 <w:rFonts w:ascii="Times New Roman" w:eastAsia="SimSun" w:hAnsi="Times New Roman" w:cs="DengXian"/>
@@ -1512,7 +2168,6 @@
               </w:rPr>
               <w:t>weight_decay</w:t>
             </w:r>
-            <w:proofErr w:type="spellEnd"/>
           </w:p>
         </w:tc>
         <w:tc>
@@ -1658,7 +2313,6 @@
                 <w:szCs w:val="24"/>
               </w:rPr>
             </w:pPr>
-            <w:proofErr w:type="spellStart"/>
             <w:r>
               <w:rPr>
                 <w:rFonts w:ascii="Times New Roman" w:eastAsia="SimSun" w:hAnsi="Times New Roman" w:cs="DengXian"/>
@@ -1668,7 +2322,6 @@
               </w:rPr>
               <w:t>batch_size</w:t>
             </w:r>
-            <w:proofErr w:type="spellEnd"/>
           </w:p>
         </w:tc>
         <w:tc>
@@ -1778,25 +2431,14 @@
                 <w:szCs w:val="24"/>
               </w:rPr>
             </w:pPr>
-            <w:proofErr w:type="spellStart"/>
-            <w:r>
-              <w:rPr>
-                <w:rFonts w:ascii="Times New Roman" w:eastAsia="SimSun" w:hAnsi="Times New Roman" w:cs="DengXian"/>
-                <w:kern w:val="0"/>
-                <w:sz w:val="24"/>
-                <w:szCs w:val="24"/>
-              </w:rPr>
-              <w:t>hidden_dim</w:t>
-            </w:r>
-            <w:proofErr w:type="spellEnd"/>
-            <w:r>
-              <w:rPr>
-                <w:rFonts w:ascii="Times New Roman" w:eastAsia="SimSun" w:hAnsi="Times New Roman" w:cs="DengXian"/>
-                <w:kern w:val="0"/>
-                <w:sz w:val="24"/>
-                <w:szCs w:val="24"/>
-              </w:rPr>
-              <w:t xml:space="preserve"> </w:t>
+            <w:r>
+              <w:rPr>
+                <w:rFonts w:ascii="Times New Roman" w:eastAsia="SimSun" w:hAnsi="Times New Roman" w:cs="DengXian"/>
+                <w:kern w:val="0"/>
+                <w:sz w:val="24"/>
+                <w:szCs w:val="24"/>
+              </w:rPr>
+              <w:t xml:space="preserve">hidden_dim </w:t>
             </w:r>
             <w:r>
               <w:rPr>
@@ -1903,25 +2545,14 @@
         </w:rPr>
         <w:t>利用</w:t>
       </w:r>
-      <w:proofErr w:type="spellStart"/>
-      <w:r>
-        <w:rPr>
-          <w:rFonts w:ascii="Times New Roman" w:eastAsia="SimSun" w:hAnsi="Times New Roman" w:cs="DengXian" w:hint="eastAsia"/>
-          <w:kern w:val="0"/>
-          <w:sz w:val="24"/>
-          <w:szCs w:val="24"/>
-        </w:rPr>
-        <w:t>Deepseek</w:t>
-      </w:r>
-      <w:proofErr w:type="spellEnd"/>
-      <w:r>
-        <w:rPr>
-          <w:rFonts w:ascii="Times New Roman" w:eastAsia="SimSun" w:hAnsi="Times New Roman" w:cs="DengXian" w:hint="eastAsia"/>
-          <w:kern w:val="0"/>
-          <w:sz w:val="24"/>
-          <w:szCs w:val="24"/>
-        </w:rPr>
-        <w:t xml:space="preserve"> Harness</w:t>
+      <w:r>
+        <w:rPr>
+          <w:rFonts w:ascii="Times New Roman" w:eastAsia="SimSun" w:hAnsi="Times New Roman" w:cs="DengXian" w:hint="eastAsia"/>
+          <w:kern w:val="0"/>
+          <w:sz w:val="24"/>
+          <w:szCs w:val="24"/>
+        </w:rPr>
+        <w:t>Deepseek Harness</w:t>
       </w:r>
       <w:r>
         <w:rPr>
@@ -2111,7 +2742,7 @@
           <w:noProof/>
         </w:rPr>
         <w:drawing>
-          <wp:inline distT="0" distB="0" distL="0" distR="0" wp14:anchorId="59AD1C60" wp14:editId="761A34FF">
+          <wp:inline distT="0" distB="0" distL="0" distR="0" wp14:anchorId="59AD1C60" wp14:editId="3CD473A6">
             <wp:extent cx="3889094" cy="2117395"/>
             <wp:effectExtent l="0" t="0" r="0" b="0"/>
             <wp:docPr id="536423093" name="图片 1"/>
@@ -2126,7 +2757,7 @@
                     <pic:cNvPicPr/>
                   </pic:nvPicPr>
                   <pic:blipFill>
-                    <a:blip r:embed="rId8" cstate="print">
+                    <a:blip r:embed="rId10" cstate="print">
                       <a:extLst>
                         <a:ext uri="{28A0092B-C50C-407E-A947-70E740481C1C}">
                           <a14:useLocalDpi xmlns:a14="http://schemas.microsoft.com/office/drawing/2010/main" val="0"/>
@@ -2172,25 +2803,7 @@
           <w:sz w:val="24"/>
           <w:szCs w:val="24"/>
         </w:rPr>
-        <w:t>图</w:t>
-      </w:r>
-      <w:r>
-        <w:rPr>
-          <w:rFonts w:ascii="Times New Roman" w:eastAsia="SimSun" w:hAnsi="Times New Roman" w:cs="DengXian" w:hint="eastAsia"/>
-          <w:kern w:val="0"/>
-          <w:sz w:val="24"/>
-          <w:szCs w:val="24"/>
-        </w:rPr>
-        <w:t>三</w:t>
-      </w:r>
-      <w:r>
-        <w:rPr>
-          <w:rFonts w:ascii="Times New Roman" w:eastAsia="SimSun" w:hAnsi="Times New Roman" w:cs="DengXian" w:hint="eastAsia"/>
-          <w:kern w:val="0"/>
-          <w:sz w:val="24"/>
-          <w:szCs w:val="24"/>
-        </w:rPr>
-        <w:t>：</w:t>
+        <w:t>图三：</w:t>
       </w:r>
       <w:r>
         <w:rPr>
@@ -2233,7 +2846,6 @@
           <w:sz w:val="30"/>
           <w:szCs w:val="30"/>
         </w:rPr>
-        <w:lastRenderedPageBreak/>
         <w:t>CNN</w:t>
       </w:r>
     </w:p>
@@ -2252,6 +2864,7 @@
         <w:rPr>
           <w:noProof/>
         </w:rPr>
+        <w:lastRenderedPageBreak/>
         <w:drawing>
           <wp:inline distT="0" distB="0" distL="0" distR="0" wp14:anchorId="3948AD4E" wp14:editId="2186F0D7">
             <wp:extent cx="3420217" cy="3754596"/>
@@ -2268,7 +2881,7 @@
                     <pic:cNvPicPr/>
                   </pic:nvPicPr>
                   <pic:blipFill>
-                    <a:blip r:embed="rId9">
+                    <a:blip r:embed="rId11">
                       <a:extLst>
                         <a:ext uri="{28A0092B-C50C-407E-A947-70E740481C1C}">
                           <a14:useLocalDpi xmlns:a14="http://schemas.microsoft.com/office/drawing/2010/main" val="0"/>
@@ -2499,7 +3112,6 @@
         </w:rPr>
         <w:t>的</w:t>
       </w:r>
-      <w:proofErr w:type="spellStart"/>
       <w:r>
         <w:rPr>
           <w:rFonts w:ascii="Times New Roman" w:eastAsia="SimSun" w:hAnsi="Times New Roman" w:cs="DengXian" w:hint="eastAsia"/>
@@ -2509,7 +3121,6 @@
         </w:rPr>
         <w:t>ResNet</w:t>
       </w:r>
-      <w:proofErr w:type="spellEnd"/>
       <w:r>
         <w:rPr>
           <w:rFonts w:ascii="Times New Roman" w:eastAsia="SimSun" w:hAnsi="Times New Roman" w:cs="DengXian" w:hint="eastAsia"/>
@@ -2653,7 +3264,6 @@
                 <w:szCs w:val="24"/>
               </w:rPr>
             </w:pPr>
-            <w:proofErr w:type="spellStart"/>
             <w:r>
               <w:rPr>
                 <w:rFonts w:ascii="Times New Roman" w:eastAsia="SimSun" w:hAnsi="Times New Roman" w:cs="DengXian"/>
@@ -2665,7 +3275,6 @@
               </w:rPr>
               <w:t>val_acc</w:t>
             </w:r>
-            <w:proofErr w:type="spellEnd"/>
           </w:p>
         </w:tc>
         <w:tc>
@@ -2748,7 +3357,6 @@
                 <w:szCs w:val="24"/>
               </w:rPr>
             </w:pPr>
-            <w:proofErr w:type="spellStart"/>
             <w:r>
               <w:rPr>
                 <w:rFonts w:ascii="Times New Roman" w:eastAsia="SimSun" w:hAnsi="Times New Roman" w:cs="DengXian"/>
@@ -2758,7 +3366,6 @@
               </w:rPr>
               <w:t>val_loss</w:t>
             </w:r>
-            <w:proofErr w:type="spellEnd"/>
           </w:p>
         </w:tc>
         <w:tc>
@@ -2779,7 +3386,7 @@
               <w:ind w:firstLine="420"/>
               <w:jc w:val="center"/>
               <w:rPr>
-                <w:rFonts w:ascii="Times New Roman" w:eastAsia="SimSun" w:hAnsi="Times New Roman" w:cs="DengXian" w:hint="eastAsia"/>
+                <w:rFonts w:ascii="Times New Roman" w:eastAsia="SimSun" w:hAnsi="Times New Roman" w:cs="DengXian"/>
                 <w:kern w:val="0"/>
                 <w:sz w:val="24"/>
                 <w:szCs w:val="24"/>
@@ -2834,7 +3441,6 @@
                 <w:szCs w:val="24"/>
               </w:rPr>
             </w:pPr>
-            <w:proofErr w:type="spellStart"/>
             <w:r>
               <w:rPr>
                 <w:rFonts w:ascii="Times New Roman" w:eastAsia="SimSun" w:hAnsi="Times New Roman" w:cs="DengXian"/>
@@ -2844,7 +3450,6 @@
               </w:rPr>
               <w:t>lr</w:t>
             </w:r>
-            <w:proofErr w:type="spellEnd"/>
           </w:p>
         </w:tc>
         <w:tc>
@@ -2865,7 +3470,7 @@
               <w:ind w:firstLine="420"/>
               <w:jc w:val="center"/>
               <w:rPr>
-                <w:rFonts w:ascii="Times New Roman" w:eastAsia="SimSun" w:hAnsi="Times New Roman" w:cs="DengXian" w:hint="eastAsia"/>
+                <w:rFonts w:ascii="Times New Roman" w:eastAsia="SimSun" w:hAnsi="Times New Roman" w:cs="DengXian"/>
                 <w:kern w:val="0"/>
                 <w:sz w:val="24"/>
                 <w:szCs w:val="24"/>
@@ -2957,7 +3562,6 @@
                 <w:szCs w:val="24"/>
               </w:rPr>
             </w:pPr>
-            <w:proofErr w:type="spellStart"/>
             <w:r>
               <w:rPr>
                 <w:rFonts w:ascii="Times New Roman" w:eastAsia="SimSun" w:hAnsi="Times New Roman" w:cs="DengXian"/>
@@ -2967,7 +3571,6 @@
               </w:rPr>
               <w:t>weight_decay</w:t>
             </w:r>
-            <w:proofErr w:type="spellEnd"/>
           </w:p>
         </w:tc>
         <w:tc>
@@ -2988,7 +3591,7 @@
               <w:ind w:firstLine="420"/>
               <w:jc w:val="center"/>
               <w:rPr>
-                <w:rFonts w:ascii="Times New Roman" w:eastAsia="SimSun" w:hAnsi="Times New Roman" w:cs="DengXian" w:hint="eastAsia"/>
+                <w:rFonts w:ascii="Times New Roman" w:eastAsia="SimSun" w:hAnsi="Times New Roman" w:cs="DengXian"/>
                 <w:kern w:val="0"/>
                 <w:sz w:val="24"/>
                 <w:szCs w:val="24"/>
@@ -3043,7 +3646,6 @@
                 <w:sz w:val="24"/>
                 <w:szCs w:val="24"/>
               </w:rPr>
-              <w:lastRenderedPageBreak/>
               <w:t>dropout</w:t>
             </w:r>
           </w:p>
@@ -3066,7 +3668,7 @@
               <w:ind w:firstLine="420"/>
               <w:jc w:val="center"/>
               <w:rPr>
-                <w:rFonts w:ascii="Times New Roman" w:eastAsia="SimSun" w:hAnsi="Times New Roman" w:cs="DengXian" w:hint="eastAsia"/>
+                <w:rFonts w:ascii="Times New Roman" w:eastAsia="SimSun" w:hAnsi="Times New Roman" w:cs="DengXian"/>
                 <w:kern w:val="0"/>
                 <w:sz w:val="24"/>
                 <w:szCs w:val="24"/>
@@ -3125,17 +3727,16 @@
                 <w:szCs w:val="24"/>
               </w:rPr>
             </w:pPr>
-            <w:proofErr w:type="spellStart"/>
-            <w:r>
-              <w:rPr>
-                <w:rFonts w:ascii="Times New Roman" w:eastAsia="SimSun" w:hAnsi="Times New Roman" w:cs="DengXian"/>
-                <w:kern w:val="0"/>
-                <w:sz w:val="24"/>
-                <w:szCs w:val="24"/>
-              </w:rPr>
+            <w:r>
+              <w:rPr>
+                <w:rFonts w:ascii="Times New Roman" w:eastAsia="SimSun" w:hAnsi="Times New Roman" w:cs="DengXian"/>
+                <w:kern w:val="0"/>
+                <w:sz w:val="24"/>
+                <w:szCs w:val="24"/>
+              </w:rPr>
+              <w:lastRenderedPageBreak/>
               <w:t>batch_size</w:t>
             </w:r>
-            <w:proofErr w:type="spellEnd"/>
           </w:p>
         </w:tc>
         <w:tc>
@@ -3245,25 +3846,14 @@
                 <w:szCs w:val="24"/>
               </w:rPr>
             </w:pPr>
-            <w:proofErr w:type="spellStart"/>
-            <w:r>
-              <w:rPr>
-                <w:rFonts w:ascii="Times New Roman" w:eastAsia="SimSun" w:hAnsi="Times New Roman" w:cs="DengXian"/>
-                <w:kern w:val="0"/>
-                <w:sz w:val="24"/>
-                <w:szCs w:val="24"/>
-              </w:rPr>
-              <w:t>base_width</w:t>
-            </w:r>
-            <w:proofErr w:type="spellEnd"/>
-            <w:r>
-              <w:rPr>
-                <w:rFonts w:ascii="Times New Roman" w:eastAsia="SimSun" w:hAnsi="Times New Roman" w:cs="DengXian"/>
-                <w:kern w:val="0"/>
-                <w:sz w:val="24"/>
-                <w:szCs w:val="24"/>
-              </w:rPr>
-              <w:t xml:space="preserve"> 64, layers (2,2,2,2)</w:t>
+            <w:r>
+              <w:rPr>
+                <w:rFonts w:ascii="Times New Roman" w:eastAsia="SimSun" w:hAnsi="Times New Roman" w:cs="DengXian"/>
+                <w:kern w:val="0"/>
+                <w:sz w:val="24"/>
+                <w:szCs w:val="24"/>
+              </w:rPr>
+              <w:t>base_width 64, layers (2,2,2,2)</w:t>
             </w:r>
           </w:p>
         </w:tc>
@@ -3357,25 +3947,14 @@
         </w:rPr>
         <w:t>利用</w:t>
       </w:r>
-      <w:proofErr w:type="spellStart"/>
-      <w:r>
-        <w:rPr>
-          <w:rFonts w:ascii="Times New Roman" w:eastAsia="SimSun" w:hAnsi="Times New Roman" w:cs="DengXian" w:hint="eastAsia"/>
-          <w:kern w:val="0"/>
-          <w:sz w:val="24"/>
-          <w:szCs w:val="24"/>
-        </w:rPr>
-        <w:t>Deepseek</w:t>
-      </w:r>
-      <w:proofErr w:type="spellEnd"/>
-      <w:r>
-        <w:rPr>
-          <w:rFonts w:ascii="Times New Roman" w:eastAsia="SimSun" w:hAnsi="Times New Roman" w:cs="DengXian" w:hint="eastAsia"/>
-          <w:kern w:val="0"/>
-          <w:sz w:val="24"/>
-          <w:szCs w:val="24"/>
-        </w:rPr>
-        <w:t xml:space="preserve"> Harness</w:t>
+      <w:r>
+        <w:rPr>
+          <w:rFonts w:ascii="Times New Roman" w:eastAsia="SimSun" w:hAnsi="Times New Roman" w:cs="DengXian" w:hint="eastAsia"/>
+          <w:kern w:val="0"/>
+          <w:sz w:val="24"/>
+          <w:szCs w:val="24"/>
+        </w:rPr>
+        <w:t>Deepseek Harness</w:t>
       </w:r>
       <w:r>
         <w:rPr>
@@ -3484,7 +4063,7 @@
           <w:noProof/>
         </w:rPr>
         <w:drawing>
-          <wp:inline distT="0" distB="0" distL="0" distR="0" wp14:anchorId="0DCE0C2C" wp14:editId="37AA6611">
+          <wp:inline distT="0" distB="0" distL="0" distR="0" wp14:anchorId="0DCE0C2C" wp14:editId="56560396">
             <wp:extent cx="3906394" cy="2126815"/>
             <wp:effectExtent l="0" t="0" r="0" b="6985"/>
             <wp:docPr id="359007765" name="图片 1"/>
@@ -3499,7 +4078,7 @@
                     <pic:cNvPicPr/>
                   </pic:nvPicPr>
                   <pic:blipFill>
-                    <a:blip r:embed="rId10" cstate="print">
+                    <a:blip r:embed="rId12" cstate="print">
                       <a:extLst>
                         <a:ext uri="{28A0092B-C50C-407E-A947-70E740481C1C}">
                           <a14:useLocalDpi xmlns:a14="http://schemas.microsoft.com/office/drawing/2010/main" val="0"/>
@@ -3545,43 +4124,16 @@
           <w:sz w:val="24"/>
           <w:szCs w:val="24"/>
         </w:rPr>
-        <w:t>图</w:t>
-      </w:r>
-      <w:r>
-        <w:rPr>
-          <w:rFonts w:ascii="Times New Roman" w:eastAsia="SimSun" w:hAnsi="Times New Roman" w:cs="DengXian" w:hint="eastAsia"/>
-          <w:kern w:val="0"/>
-          <w:sz w:val="24"/>
-          <w:szCs w:val="24"/>
-        </w:rPr>
-        <w:t>五</w:t>
-      </w:r>
-      <w:r>
-        <w:rPr>
-          <w:rFonts w:ascii="Times New Roman" w:eastAsia="SimSun" w:hAnsi="Times New Roman" w:cs="DengXian" w:hint="eastAsia"/>
-          <w:kern w:val="0"/>
-          <w:sz w:val="24"/>
-          <w:szCs w:val="24"/>
-        </w:rPr>
-        <w:t>：</w:t>
-      </w:r>
-      <w:r>
-        <w:rPr>
-          <w:rFonts w:ascii="Times New Roman" w:eastAsia="SimSun" w:hAnsi="Times New Roman" w:cs="DengXian" w:hint="eastAsia"/>
-          <w:kern w:val="0"/>
-          <w:sz w:val="24"/>
-          <w:szCs w:val="24"/>
-        </w:rPr>
-        <w:t>C</w:t>
-      </w:r>
-      <w:r>
-        <w:rPr>
-          <w:rFonts w:ascii="Times New Roman" w:eastAsia="SimSun" w:hAnsi="Times New Roman" w:cs="DengXian" w:hint="eastAsia"/>
-          <w:kern w:val="0"/>
-          <w:sz w:val="24"/>
-          <w:szCs w:val="24"/>
-        </w:rPr>
-        <w:t>NN</w:t>
+        <w:t>图五：</w:t>
+      </w:r>
+      <w:r>
+        <w:rPr>
+          <w:rFonts w:ascii="Times New Roman" w:eastAsia="SimSun" w:hAnsi="Times New Roman" w:cs="DengXian" w:hint="eastAsia"/>
+          <w:kern w:val="0"/>
+          <w:sz w:val="24"/>
+          <w:szCs w:val="24"/>
+        </w:rPr>
+        <w:t>CNN</w:t>
       </w:r>
       <w:r>
         <w:rPr>
@@ -3756,7 +4308,7 @@
         </w:rPr>
         <w:lastRenderedPageBreak/>
         <w:drawing>
-          <wp:inline distT="0" distB="0" distL="0" distR="0" wp14:anchorId="35B9F523" wp14:editId="4BF14717">
+          <wp:inline distT="0" distB="0" distL="0" distR="0" wp14:anchorId="35B9F523" wp14:editId="3BF8E42A">
             <wp:extent cx="3420217" cy="3284884"/>
             <wp:effectExtent l="0" t="0" r="8890" b="0"/>
             <wp:docPr id="322531473" name="图片 1"/>
@@ -3771,7 +4323,7 @@
                     <pic:cNvPicPr/>
                   </pic:nvPicPr>
                   <pic:blipFill>
-                    <a:blip r:embed="rId11" cstate="print">
+                    <a:blip r:embed="rId13" cstate="print">
                       <a:extLst>
                         <a:ext uri="{28A0092B-C50C-407E-A947-70E740481C1C}">
                           <a14:useLocalDpi xmlns:a14="http://schemas.microsoft.com/office/drawing/2010/main" val="0"/>
@@ -3803,7 +4355,7 @@
         <w:spacing w:line="360" w:lineRule="auto"/>
         <w:jc w:val="center"/>
         <w:rPr>
-          <w:rFonts w:ascii="Times New Roman" w:eastAsia="SimSun" w:hAnsi="Times New Roman" w:cs="DengXian" w:hint="eastAsia"/>
+          <w:rFonts w:ascii="Times New Roman" w:eastAsia="SimSun" w:hAnsi="Times New Roman" w:cs="DengXian"/>
           <w:kern w:val="0"/>
           <w:sz w:val="24"/>
           <w:szCs w:val="24"/>
@@ -3861,13 +4413,12 @@
         <w:ind w:firstLine="420"/>
         <w:jc w:val="left"/>
         <w:rPr>
-          <w:rFonts w:ascii="Times New Roman" w:eastAsia="SimSun" w:hAnsi="Times New Roman" w:cs="DengXian" w:hint="eastAsia"/>
+          <w:rFonts w:ascii="Times New Roman" w:eastAsia="SimSun" w:hAnsi="Times New Roman" w:cs="DengXian"/>
           <w:kern w:val="0"/>
           <w:sz w:val="24"/>
           <w:szCs w:val="24"/>
         </w:rPr>
       </w:pPr>
-      <w:proofErr w:type="spellStart"/>
       <w:r>
         <w:rPr>
           <w:rFonts w:ascii="Times New Roman" w:eastAsia="SimSun" w:hAnsi="Times New Roman" w:cs="DengXian" w:hint="eastAsia"/>
@@ -3877,7 +4428,6 @@
         </w:rPr>
         <w:t>BiLSTM</w:t>
       </w:r>
-      <w:proofErr w:type="spellEnd"/>
       <w:r>
         <w:rPr>
           <w:rFonts w:ascii="Times New Roman" w:eastAsia="SimSun" w:hAnsi="Times New Roman" w:cs="DengXian" w:hint="eastAsia"/>
@@ -4334,7 +4884,6 @@
                 <w:szCs w:val="24"/>
               </w:rPr>
             </w:pPr>
-            <w:proofErr w:type="spellStart"/>
             <w:r>
               <w:rPr>
                 <w:rFonts w:ascii="Times New Roman" w:eastAsia="SimSun" w:hAnsi="Times New Roman" w:cs="DengXian"/>
@@ -4346,7 +4895,6 @@
               </w:rPr>
               <w:t>val_acc</w:t>
             </w:r>
-            <w:proofErr w:type="spellEnd"/>
           </w:p>
         </w:tc>
         <w:tc>
@@ -4429,7 +4977,6 @@
                 <w:szCs w:val="24"/>
               </w:rPr>
             </w:pPr>
-            <w:proofErr w:type="spellStart"/>
             <w:r>
               <w:rPr>
                 <w:rFonts w:ascii="Times New Roman" w:eastAsia="SimSun" w:hAnsi="Times New Roman" w:cs="DengXian"/>
@@ -4439,7 +4986,6 @@
               </w:rPr>
               <w:t>val_loss</w:t>
             </w:r>
-            <w:proofErr w:type="spellEnd"/>
           </w:p>
         </w:tc>
         <w:tc>
@@ -4460,7 +5006,7 @@
               <w:ind w:firstLine="420"/>
               <w:jc w:val="center"/>
               <w:rPr>
-                <w:rFonts w:ascii="Times New Roman" w:eastAsia="SimSun" w:hAnsi="Times New Roman" w:cs="DengXian" w:hint="eastAsia"/>
+                <w:rFonts w:ascii="Times New Roman" w:eastAsia="SimSun" w:hAnsi="Times New Roman" w:cs="DengXian"/>
                 <w:kern w:val="0"/>
                 <w:sz w:val="24"/>
                 <w:szCs w:val="24"/>
@@ -4515,7 +5061,6 @@
                 <w:szCs w:val="24"/>
               </w:rPr>
             </w:pPr>
-            <w:proofErr w:type="spellStart"/>
             <w:r>
               <w:rPr>
                 <w:rFonts w:ascii="Times New Roman" w:eastAsia="SimSun" w:hAnsi="Times New Roman" w:cs="DengXian"/>
@@ -4525,7 +5070,6 @@
               </w:rPr>
               <w:t>lr</w:t>
             </w:r>
-            <w:proofErr w:type="spellEnd"/>
           </w:p>
         </w:tc>
         <w:tc>
@@ -4546,7 +5090,7 @@
               <w:ind w:firstLine="420"/>
               <w:jc w:val="center"/>
               <w:rPr>
-                <w:rFonts w:ascii="Times New Roman" w:eastAsia="SimSun" w:hAnsi="Times New Roman" w:cs="DengXian" w:hint="eastAsia"/>
+                <w:rFonts w:ascii="Times New Roman" w:eastAsia="SimSun" w:hAnsi="Times New Roman" w:cs="DengXian"/>
                 <w:kern w:val="0"/>
                 <w:sz w:val="24"/>
                 <w:szCs w:val="24"/>
@@ -4638,7 +5182,6 @@
                 <w:szCs w:val="24"/>
               </w:rPr>
             </w:pPr>
-            <w:proofErr w:type="spellStart"/>
             <w:r>
               <w:rPr>
                 <w:rFonts w:ascii="Times New Roman" w:eastAsia="SimSun" w:hAnsi="Times New Roman" w:cs="DengXian"/>
@@ -4648,7 +5191,6 @@
               </w:rPr>
               <w:t>weight_decay</w:t>
             </w:r>
-            <w:proofErr w:type="spellEnd"/>
           </w:p>
         </w:tc>
         <w:tc>
@@ -4669,7 +5211,7 @@
               <w:ind w:firstLine="420"/>
               <w:jc w:val="center"/>
               <w:rPr>
-                <w:rFonts w:ascii="Times New Roman" w:eastAsia="SimSun" w:hAnsi="Times New Roman" w:cs="DengXian" w:hint="eastAsia"/>
+                <w:rFonts w:ascii="Times New Roman" w:eastAsia="SimSun" w:hAnsi="Times New Roman" w:cs="DengXian"/>
                 <w:kern w:val="0"/>
                 <w:sz w:val="24"/>
                 <w:szCs w:val="24"/>
@@ -4791,7 +5333,7 @@
               <w:ind w:firstLine="420"/>
               <w:jc w:val="center"/>
               <w:rPr>
-                <w:rFonts w:ascii="Times New Roman" w:eastAsia="SimSun" w:hAnsi="Times New Roman" w:cs="DengXian" w:hint="eastAsia"/>
+                <w:rFonts w:ascii="Times New Roman" w:eastAsia="SimSun" w:hAnsi="Times New Roman" w:cs="DengXian"/>
                 <w:kern w:val="0"/>
                 <w:sz w:val="24"/>
                 <w:szCs w:val="24"/>
@@ -4861,7 +5403,6 @@
                 <w:szCs w:val="24"/>
               </w:rPr>
             </w:pPr>
-            <w:proofErr w:type="spellStart"/>
             <w:r>
               <w:rPr>
                 <w:rFonts w:ascii="Times New Roman" w:eastAsia="SimSun" w:hAnsi="Times New Roman" w:cs="DengXian"/>
@@ -4871,7 +5412,6 @@
               </w:rPr>
               <w:t>batch_size</w:t>
             </w:r>
-            <w:proofErr w:type="spellEnd"/>
           </w:p>
         </w:tc>
         <w:tc>
@@ -4979,65 +5519,14 @@
                 <w:szCs w:val="24"/>
               </w:rPr>
             </w:pPr>
-            <w:proofErr w:type="spellStart"/>
-            <w:r>
-              <w:rPr>
-                <w:rFonts w:ascii="Times New Roman" w:eastAsia="SimSun" w:hAnsi="Times New Roman" w:cs="DengXian"/>
-                <w:kern w:val="0"/>
-                <w:sz w:val="24"/>
-                <w:szCs w:val="24"/>
-              </w:rPr>
-              <w:t>rnn_hidden</w:t>
-            </w:r>
-            <w:proofErr w:type="spellEnd"/>
-            <w:r>
-              <w:rPr>
-                <w:rFonts w:ascii="Times New Roman" w:eastAsia="SimSun" w:hAnsi="Times New Roman" w:cs="DengXian"/>
-                <w:kern w:val="0"/>
-                <w:sz w:val="24"/>
-                <w:szCs w:val="24"/>
-              </w:rPr>
-              <w:t xml:space="preserve"> 128, </w:t>
-            </w:r>
-            <w:proofErr w:type="spellStart"/>
-            <w:r>
-              <w:rPr>
-                <w:rFonts w:ascii="Times New Roman" w:eastAsia="SimSun" w:hAnsi="Times New Roman" w:cs="DengXian"/>
-                <w:kern w:val="0"/>
-                <w:sz w:val="24"/>
-                <w:szCs w:val="24"/>
-              </w:rPr>
-              <w:t>hidden_dim</w:t>
-            </w:r>
-            <w:proofErr w:type="spellEnd"/>
-            <w:r>
-              <w:rPr>
-                <w:rFonts w:ascii="Times New Roman" w:eastAsia="SimSun" w:hAnsi="Times New Roman" w:cs="DengXian"/>
-                <w:kern w:val="0"/>
-                <w:sz w:val="24"/>
-                <w:szCs w:val="24"/>
-              </w:rPr>
-              <w:t xml:space="preserve"> 256, </w:t>
-            </w:r>
-            <w:proofErr w:type="spellStart"/>
-            <w:r>
-              <w:rPr>
-                <w:rFonts w:ascii="Times New Roman" w:eastAsia="SimSun" w:hAnsi="Times New Roman" w:cs="DengXian"/>
-                <w:kern w:val="0"/>
-                <w:sz w:val="24"/>
-                <w:szCs w:val="24"/>
-              </w:rPr>
-              <w:t>num_layers</w:t>
-            </w:r>
-            <w:proofErr w:type="spellEnd"/>
-            <w:r>
-              <w:rPr>
-                <w:rFonts w:ascii="Times New Roman" w:eastAsia="SimSun" w:hAnsi="Times New Roman" w:cs="DengXian"/>
-                <w:kern w:val="0"/>
-                <w:sz w:val="24"/>
-                <w:szCs w:val="24"/>
-              </w:rPr>
-              <w:t xml:space="preserve"> 1, bidirectional</w:t>
+            <w:r>
+              <w:rPr>
+                <w:rFonts w:ascii="Times New Roman" w:eastAsia="SimSun" w:hAnsi="Times New Roman" w:cs="DengXian"/>
+                <w:kern w:val="0"/>
+                <w:sz w:val="24"/>
+                <w:szCs w:val="24"/>
+              </w:rPr>
+              <w:t>rnn_hidden 128, hidden_dim 256, num_layers 1, bidirectional</w:t>
             </w:r>
           </w:p>
         </w:tc>
@@ -5049,7 +5538,7 @@
         <w:ind w:firstLine="420"/>
         <w:jc w:val="center"/>
         <w:rPr>
-          <w:rFonts w:ascii="Times New Roman" w:eastAsia="SimSun" w:hAnsi="Times New Roman" w:cs="DengXian" w:hint="eastAsia"/>
+          <w:rFonts w:ascii="Times New Roman" w:eastAsia="SimSun" w:hAnsi="Times New Roman" w:cs="DengXian"/>
           <w:kern w:val="0"/>
           <w:sz w:val="24"/>
           <w:szCs w:val="24"/>
@@ -5219,16 +5708,7 @@
           <w:sz w:val="24"/>
           <w:szCs w:val="24"/>
         </w:rPr>
-        <w:t>性能较为一般，</w:t>
-      </w:r>
-      <w:r>
-        <w:rPr>
-          <w:rFonts w:ascii="Times New Roman" w:eastAsia="SimSun" w:hAnsi="Times New Roman" w:cs="DengXian" w:hint="eastAsia"/>
-          <w:kern w:val="0"/>
-          <w:sz w:val="24"/>
-          <w:szCs w:val="24"/>
-        </w:rPr>
-        <w:t>下图为</w:t>
+        <w:t>性能较为一般，下图为</w:t>
       </w:r>
       <w:r>
         <w:rPr>
@@ -5265,7 +5745,7 @@
           <w:noProof/>
         </w:rPr>
         <w:drawing>
-          <wp:inline distT="0" distB="0" distL="0" distR="0" wp14:anchorId="36B1F6D6" wp14:editId="531FC03D">
+          <wp:inline distT="0" distB="0" distL="0" distR="0" wp14:anchorId="36B1F6D6" wp14:editId="768DE0E0">
             <wp:extent cx="3906394" cy="2126814"/>
             <wp:effectExtent l="0" t="0" r="0" b="6985"/>
             <wp:docPr id="1941094251" name="图片 1"/>
@@ -5280,7 +5760,7 @@
                     <pic:cNvPicPr/>
                   </pic:nvPicPr>
                   <pic:blipFill>
-                    <a:blip r:embed="rId12" cstate="print">
+                    <a:blip r:embed="rId14" cstate="print">
                       <a:extLst>
                         <a:ext uri="{28A0092B-C50C-407E-A947-70E740481C1C}">
                           <a14:useLocalDpi xmlns:a14="http://schemas.microsoft.com/office/drawing/2010/main" val="0"/>
@@ -5313,7 +5793,7 @@
         <w:ind w:firstLine="420"/>
         <w:jc w:val="center"/>
         <w:rPr>
-          <w:rFonts w:ascii="Times New Roman" w:eastAsia="SimSun" w:hAnsi="Times New Roman" w:cs="DengXian" w:hint="eastAsia"/>
+          <w:rFonts w:ascii="Times New Roman" w:eastAsia="SimSun" w:hAnsi="Times New Roman" w:cs="DengXian"/>
           <w:kern w:val="0"/>
           <w:sz w:val="24"/>
           <w:szCs w:val="24"/>
@@ -5326,25 +5806,7 @@
           <w:sz w:val="24"/>
           <w:szCs w:val="24"/>
         </w:rPr>
-        <w:t>图</w:t>
-      </w:r>
-      <w:r>
-        <w:rPr>
-          <w:rFonts w:ascii="Times New Roman" w:eastAsia="SimSun" w:hAnsi="Times New Roman" w:cs="DengXian" w:hint="eastAsia"/>
-          <w:kern w:val="0"/>
-          <w:sz w:val="24"/>
-          <w:szCs w:val="24"/>
-        </w:rPr>
-        <w:t>七</w:t>
-      </w:r>
-      <w:r>
-        <w:rPr>
-          <w:rFonts w:ascii="Times New Roman" w:eastAsia="SimSun" w:hAnsi="Times New Roman" w:cs="DengXian" w:hint="eastAsia"/>
-          <w:kern w:val="0"/>
-          <w:sz w:val="24"/>
-          <w:szCs w:val="24"/>
-        </w:rPr>
-        <w:t>：</w:t>
+        <w:t>图七：</w:t>
       </w:r>
       <w:r>
         <w:rPr>
@@ -5380,7 +5842,6 @@
           <w:szCs w:val="30"/>
         </w:rPr>
       </w:pPr>
-      <w:proofErr w:type="spellStart"/>
       <w:r>
         <w:rPr>
           <w:rFonts w:ascii="Times New Roman" w:eastAsia="SimSun" w:hAnsi="Times New Roman" w:cs="DengXian" w:hint="eastAsia"/>
@@ -5390,7 +5851,6 @@
         </w:rPr>
         <w:t>CNN+attention</w:t>
       </w:r>
-      <w:proofErr w:type="spellEnd"/>
     </w:p>
     <w:p>
       <w:pPr>
@@ -5466,7 +5926,7 @@
                     <pic:cNvPicPr/>
                   </pic:nvPicPr>
                   <pic:blipFill>
-                    <a:blip r:embed="rId13"/>
+                    <a:blip r:embed="rId15"/>
                     <a:stretch>
                       <a:fillRect/>
                     </a:stretch>
@@ -5493,7 +5953,7 @@
         <w:ind w:firstLine="420"/>
         <w:jc w:val="center"/>
         <w:rPr>
-          <w:rFonts w:ascii="Times New Roman" w:eastAsia="SimSun" w:hAnsi="Times New Roman" w:cs="DengXian" w:hint="eastAsia"/>
+          <w:rFonts w:ascii="Times New Roman" w:eastAsia="SimSun" w:hAnsi="Times New Roman" w:cs="DengXian"/>
           <w:kern w:val="0"/>
           <w:sz w:val="24"/>
           <w:szCs w:val="24"/>
@@ -5506,27 +5966,8 @@
           <w:sz w:val="24"/>
           <w:szCs w:val="24"/>
         </w:rPr>
-        <w:t>图</w:t>
-      </w:r>
-      <w:r>
-        <w:rPr>
-          <w:rFonts w:ascii="Times New Roman" w:eastAsia="SimSun" w:hAnsi="Times New Roman" w:cs="DengXian" w:hint="eastAsia"/>
-          <w:kern w:val="0"/>
-          <w:sz w:val="24"/>
-          <w:szCs w:val="24"/>
-        </w:rPr>
-        <w:t>八</w:t>
-      </w:r>
-      <w:r>
-        <w:rPr>
-          <w:rFonts w:ascii="Times New Roman" w:eastAsia="SimSun" w:hAnsi="Times New Roman" w:cs="DengXian" w:hint="eastAsia"/>
-          <w:kern w:val="0"/>
-          <w:sz w:val="24"/>
-          <w:szCs w:val="24"/>
-        </w:rPr>
-        <w:t>：</w:t>
-      </w:r>
-      <w:proofErr w:type="spellStart"/>
+        <w:t>图八：</w:t>
+      </w:r>
       <w:r>
         <w:rPr>
           <w:rFonts w:ascii="Times New Roman" w:eastAsia="SimSun" w:hAnsi="Times New Roman" w:cs="DengXian" w:hint="eastAsia"/>
@@ -5554,7 +5995,6 @@
         </w:rPr>
         <w:t>attention</w:t>
       </w:r>
-      <w:proofErr w:type="spellEnd"/>
       <w:r>
         <w:rPr>
           <w:rFonts w:ascii="Times New Roman" w:eastAsia="SimSun" w:hAnsi="Times New Roman" w:cs="DengXian" w:hint="eastAsia"/>
@@ -6069,23 +6509,21 @@
               <w:ind w:firstLine="420"/>
               <w:jc w:val="center"/>
               <w:rPr>
+                <w:rFonts w:ascii="Times New Roman" w:eastAsia="SimSun" w:hAnsi="Times New Roman" w:cs="DengXian"/>
+                <w:kern w:val="0"/>
+                <w:sz w:val="24"/>
+                <w:szCs w:val="24"/>
+              </w:rPr>
+            </w:pPr>
+            <w:r>
+              <w:rPr>
                 <w:rFonts w:ascii="Times New Roman" w:eastAsia="SimSun" w:hAnsi="Times New Roman" w:cs="DengXian" w:hint="eastAsia"/>
                 <w:kern w:val="0"/>
                 <w:sz w:val="24"/>
                 <w:szCs w:val="24"/>
               </w:rPr>
-            </w:pPr>
-            <w:proofErr w:type="spellStart"/>
-            <w:r>
-              <w:rPr>
-                <w:rFonts w:ascii="Times New Roman" w:eastAsia="SimSun" w:hAnsi="Times New Roman" w:cs="DengXian" w:hint="eastAsia"/>
-                <w:kern w:val="0"/>
-                <w:sz w:val="24"/>
-                <w:szCs w:val="24"/>
-              </w:rPr>
               <w:t>CNN+attention</w:t>
             </w:r>
-            <w:proofErr w:type="spellEnd"/>
           </w:p>
         </w:tc>
       </w:tr>
@@ -6120,7 +6558,6 @@
                 <w:szCs w:val="24"/>
               </w:rPr>
             </w:pPr>
-            <w:proofErr w:type="spellStart"/>
             <w:r>
               <w:rPr>
                 <w:rFonts w:ascii="Times New Roman" w:eastAsia="SimSun" w:hAnsi="Times New Roman" w:cs="DengXian"/>
@@ -6132,7 +6569,6 @@
               </w:rPr>
               <w:t>val_acc</w:t>
             </w:r>
-            <w:proofErr w:type="spellEnd"/>
           </w:p>
         </w:tc>
         <w:tc>
@@ -6171,29 +6607,7 @@
                 <w:sz w:val="24"/>
                 <w:szCs w:val="24"/>
               </w:rPr>
-              <w:t>90</w:t>
-            </w:r>
-            <w:r>
-              <w:rPr>
-                <w:rFonts w:ascii="Times New Roman" w:eastAsia="SimSun" w:hAnsi="Times New Roman" w:cs="DengXian" w:hint="eastAsia"/>
-                <w:b/>
-                <w:bCs/>
-                <w:kern w:val="0"/>
-                <w:sz w:val="24"/>
-                <w:szCs w:val="24"/>
-              </w:rPr>
-              <w:t>.</w:t>
-            </w:r>
-            <w:r>
-              <w:rPr>
-                <w:rFonts w:ascii="Times New Roman" w:eastAsia="SimSun" w:hAnsi="Times New Roman" w:cs="DengXian" w:hint="eastAsia"/>
-                <w:b/>
-                <w:bCs/>
-                <w:kern w:val="0"/>
-                <w:sz w:val="24"/>
-                <w:szCs w:val="24"/>
-              </w:rPr>
-              <w:t>20</w:t>
+              <w:t>90.20</w:t>
             </w:r>
             <w:r>
               <w:rPr>
@@ -6237,7 +6651,6 @@
                 <w:szCs w:val="24"/>
               </w:rPr>
             </w:pPr>
-            <w:proofErr w:type="spellStart"/>
             <w:r>
               <w:rPr>
                 <w:rFonts w:ascii="Times New Roman" w:eastAsia="SimSun" w:hAnsi="Times New Roman" w:cs="DengXian"/>
@@ -6248,7 +6661,6 @@
               <w:lastRenderedPageBreak/>
               <w:t>val_loss</w:t>
             </w:r>
-            <w:proofErr w:type="spellEnd"/>
           </w:p>
         </w:tc>
         <w:tc>
@@ -6269,7 +6681,7 @@
               <w:ind w:firstLine="420"/>
               <w:jc w:val="center"/>
               <w:rPr>
-                <w:rFonts w:ascii="Times New Roman" w:eastAsia="SimSun" w:hAnsi="Times New Roman" w:cs="DengXian" w:hint="eastAsia"/>
+                <w:rFonts w:ascii="Times New Roman" w:eastAsia="SimSun" w:hAnsi="Times New Roman" w:cs="DengXian"/>
                 <w:kern w:val="0"/>
                 <w:sz w:val="24"/>
                 <w:szCs w:val="24"/>
@@ -6324,7 +6736,6 @@
                 <w:szCs w:val="24"/>
               </w:rPr>
             </w:pPr>
-            <w:proofErr w:type="spellStart"/>
             <w:r>
               <w:rPr>
                 <w:rFonts w:ascii="Times New Roman" w:eastAsia="SimSun" w:hAnsi="Times New Roman" w:cs="DengXian"/>
@@ -6334,7 +6745,6 @@
               </w:rPr>
               <w:t>lr</w:t>
             </w:r>
-            <w:proofErr w:type="spellEnd"/>
           </w:p>
         </w:tc>
         <w:tc>
@@ -6355,7 +6765,7 @@
               <w:ind w:firstLine="420"/>
               <w:jc w:val="center"/>
               <w:rPr>
-                <w:rFonts w:ascii="Times New Roman" w:eastAsia="SimSun" w:hAnsi="Times New Roman" w:cs="DengXian" w:hint="eastAsia"/>
+                <w:rFonts w:ascii="Times New Roman" w:eastAsia="SimSun" w:hAnsi="Times New Roman" w:cs="DengXian"/>
                 <w:kern w:val="0"/>
                 <w:sz w:val="24"/>
                 <w:szCs w:val="24"/>
@@ -6447,7 +6857,6 @@
                 <w:szCs w:val="24"/>
               </w:rPr>
             </w:pPr>
-            <w:proofErr w:type="spellStart"/>
             <w:r>
               <w:rPr>
                 <w:rFonts w:ascii="Times New Roman" w:eastAsia="SimSun" w:hAnsi="Times New Roman" w:cs="DengXian"/>
@@ -6457,7 +6866,6 @@
               </w:rPr>
               <w:t>weight_decay</w:t>
             </w:r>
-            <w:proofErr w:type="spellEnd"/>
           </w:p>
         </w:tc>
         <w:tc>
@@ -6478,7 +6886,7 @@
               <w:ind w:firstLine="420"/>
               <w:jc w:val="center"/>
               <w:rPr>
-                <w:rFonts w:ascii="Times New Roman" w:eastAsia="SimSun" w:hAnsi="Times New Roman" w:cs="DengXian" w:hint="eastAsia"/>
+                <w:rFonts w:ascii="Times New Roman" w:eastAsia="SimSun" w:hAnsi="Times New Roman" w:cs="DengXian"/>
                 <w:kern w:val="0"/>
                 <w:sz w:val="24"/>
                 <w:szCs w:val="24"/>
@@ -6493,29 +6901,7 @@
                 <w:sz w:val="24"/>
                 <w:szCs w:val="24"/>
               </w:rPr>
-              <w:t>1.</w:t>
-            </w:r>
-            <w:r>
-              <w:rPr>
-                <w:rFonts w:ascii="Times New Roman" w:eastAsia="SimSun" w:hAnsi="Times New Roman" w:cs="DengXian" w:hint="eastAsia"/>
-                <w:b/>
-                <w:bCs/>
-                <w:kern w:val="0"/>
-                <w:sz w:val="24"/>
-                <w:szCs w:val="24"/>
-              </w:rPr>
-              <w:t>1</w:t>
-            </w:r>
-            <w:r>
-              <w:rPr>
-                <w:rFonts w:ascii="Times New Roman" w:eastAsia="SimSun" w:hAnsi="Times New Roman" w:cs="DengXian" w:hint="eastAsia"/>
-                <w:b/>
-                <w:bCs/>
-                <w:kern w:val="0"/>
-                <w:sz w:val="24"/>
-                <w:szCs w:val="24"/>
-              </w:rPr>
-              <w:t>5e-04</w:t>
+              <w:t>1.15e-04</w:t>
             </w:r>
           </w:p>
         </w:tc>
@@ -6577,7 +6963,7 @@
               <w:ind w:firstLine="420"/>
               <w:jc w:val="center"/>
               <w:rPr>
-                <w:rFonts w:ascii="Times New Roman" w:eastAsia="SimSun" w:hAnsi="Times New Roman" w:cs="DengXian" w:hint="eastAsia"/>
+                <w:rFonts w:ascii="Times New Roman" w:eastAsia="SimSun" w:hAnsi="Times New Roman" w:cs="DengXian"/>
                 <w:kern w:val="0"/>
                 <w:sz w:val="24"/>
                 <w:szCs w:val="24"/>
@@ -6636,7 +7022,6 @@
                 <w:szCs w:val="24"/>
               </w:rPr>
             </w:pPr>
-            <w:proofErr w:type="spellStart"/>
             <w:r>
               <w:rPr>
                 <w:rFonts w:ascii="Times New Roman" w:eastAsia="SimSun" w:hAnsi="Times New Roman" w:cs="DengXian"/>
@@ -6646,7 +7031,6 @@
               </w:rPr>
               <w:t>batch_size</w:t>
             </w:r>
-            <w:proofErr w:type="spellEnd"/>
           </w:p>
         </w:tc>
         <w:tc>
@@ -6754,45 +7138,14 @@
                 <w:szCs w:val="24"/>
               </w:rPr>
             </w:pPr>
-            <w:proofErr w:type="spellStart"/>
-            <w:r>
-              <w:rPr>
-                <w:rFonts w:ascii="Times New Roman" w:eastAsia="SimSun" w:hAnsi="Times New Roman" w:cs="DengXian"/>
-                <w:kern w:val="0"/>
-                <w:sz w:val="24"/>
-                <w:szCs w:val="24"/>
-              </w:rPr>
-              <w:t>base_width</w:t>
-            </w:r>
-            <w:proofErr w:type="spellEnd"/>
-            <w:r>
-              <w:rPr>
-                <w:rFonts w:ascii="Times New Roman" w:eastAsia="SimSun" w:hAnsi="Times New Roman" w:cs="DengXian"/>
-                <w:kern w:val="0"/>
-                <w:sz w:val="24"/>
-                <w:szCs w:val="24"/>
-              </w:rPr>
-              <w:t xml:space="preserve"> 64, </w:t>
-            </w:r>
-            <w:proofErr w:type="spellStart"/>
-            <w:r>
-              <w:rPr>
-                <w:rFonts w:ascii="Times New Roman" w:eastAsia="SimSun" w:hAnsi="Times New Roman" w:cs="DengXian"/>
-                <w:kern w:val="0"/>
-                <w:sz w:val="24"/>
-                <w:szCs w:val="24"/>
-              </w:rPr>
-              <w:t>fnn_hidden</w:t>
-            </w:r>
-            <w:proofErr w:type="spellEnd"/>
-            <w:r>
-              <w:rPr>
-                <w:rFonts w:ascii="Times New Roman" w:eastAsia="SimSun" w:hAnsi="Times New Roman" w:cs="DengXian"/>
-                <w:kern w:val="0"/>
-                <w:sz w:val="24"/>
-                <w:szCs w:val="24"/>
-              </w:rPr>
-              <w:t xml:space="preserve"> 128, layers (2,2,2,2)</w:t>
+            <w:r>
+              <w:rPr>
+                <w:rFonts w:ascii="Times New Roman" w:eastAsia="SimSun" w:hAnsi="Times New Roman" w:cs="DengXian"/>
+                <w:kern w:val="0"/>
+                <w:sz w:val="24"/>
+                <w:szCs w:val="24"/>
+              </w:rPr>
+              <w:t>base_width 64, fnn_hidden 128, layers (2,2,2,2)</w:t>
             </w:r>
           </w:p>
         </w:tc>
@@ -6804,7 +7157,7 @@
         <w:ind w:firstLine="420"/>
         <w:jc w:val="center"/>
         <w:rPr>
-          <w:rFonts w:ascii="Times New Roman" w:eastAsia="SimSun" w:hAnsi="Times New Roman" w:cs="DengXian" w:hint="eastAsia"/>
+          <w:rFonts w:ascii="Times New Roman" w:eastAsia="SimSun" w:hAnsi="Times New Roman" w:cs="DengXian"/>
           <w:kern w:val="0"/>
           <w:sz w:val="24"/>
           <w:szCs w:val="24"/>
@@ -6817,25 +7170,7 @@
           <w:sz w:val="24"/>
           <w:szCs w:val="24"/>
         </w:rPr>
-        <w:t>表</w:t>
-      </w:r>
-      <w:r>
-        <w:rPr>
-          <w:rFonts w:ascii="Times New Roman" w:eastAsia="SimSun" w:hAnsi="Times New Roman" w:cs="DengXian" w:hint="eastAsia"/>
-          <w:kern w:val="0"/>
-          <w:sz w:val="24"/>
-          <w:szCs w:val="24"/>
-        </w:rPr>
-        <w:t>四</w:t>
-      </w:r>
-      <w:r>
-        <w:rPr>
-          <w:rFonts w:ascii="Times New Roman" w:eastAsia="SimSun" w:hAnsi="Times New Roman" w:cs="DengXian" w:hint="eastAsia"/>
-          <w:kern w:val="0"/>
-          <w:sz w:val="24"/>
-          <w:szCs w:val="24"/>
-        </w:rPr>
-        <w:t>：</w:t>
+        <w:t>表四：</w:t>
       </w:r>
       <w:r>
         <w:rPr>
@@ -6862,7 +7197,7 @@
         <w:ind w:firstLine="420"/>
         <w:jc w:val="left"/>
         <w:rPr>
-          <w:rFonts w:ascii="Times New Roman" w:eastAsia="SimSun" w:hAnsi="Times New Roman" w:cs="DengXian" w:hint="eastAsia"/>
+          <w:rFonts w:ascii="Times New Roman" w:eastAsia="SimSun" w:hAnsi="Times New Roman" w:cs="DengXian"/>
           <w:kern w:val="0"/>
           <w:sz w:val="24"/>
           <w:szCs w:val="24"/>
@@ -7111,7 +7446,6 @@
         </w:rPr>
         <w:t>下图为</w:t>
       </w:r>
-      <w:proofErr w:type="spellStart"/>
       <w:r>
         <w:rPr>
           <w:rFonts w:ascii="Times New Roman" w:eastAsia="SimSun" w:hAnsi="Times New Roman" w:cs="DengXian" w:hint="eastAsia"/>
@@ -7121,7 +7455,6 @@
         </w:rPr>
         <w:t>CNN+attention</w:t>
       </w:r>
-      <w:proofErr w:type="spellEnd"/>
       <w:r>
         <w:rPr>
           <w:rFonts w:ascii="Times New Roman" w:eastAsia="SimSun" w:hAnsi="Times New Roman" w:cs="DengXian" w:hint="eastAsia"/>
@@ -7162,7 +7495,7 @@
                     <pic:cNvPicPr/>
                   </pic:nvPicPr>
                   <pic:blipFill>
-                    <a:blip r:embed="rId14">
+                    <a:blip r:embed="rId16">
                       <a:extLst>
                         <a:ext uri="{28A0092B-C50C-407E-A947-70E740481C1C}">
                           <a14:useLocalDpi xmlns:a14="http://schemas.microsoft.com/office/drawing/2010/main" val="0"/>
@@ -7208,27 +7541,8 @@
           <w:sz w:val="24"/>
           <w:szCs w:val="24"/>
         </w:rPr>
-        <w:t>图</w:t>
-      </w:r>
-      <w:r>
-        <w:rPr>
-          <w:rFonts w:ascii="Times New Roman" w:eastAsia="SimSun" w:hAnsi="Times New Roman" w:cs="DengXian" w:hint="eastAsia"/>
-          <w:kern w:val="0"/>
-          <w:sz w:val="24"/>
-          <w:szCs w:val="24"/>
-        </w:rPr>
-        <w:t>九</w:t>
-      </w:r>
-      <w:r>
-        <w:rPr>
-          <w:rFonts w:ascii="Times New Roman" w:eastAsia="SimSun" w:hAnsi="Times New Roman" w:cs="DengXian" w:hint="eastAsia"/>
-          <w:kern w:val="0"/>
-          <w:sz w:val="24"/>
-          <w:szCs w:val="24"/>
-        </w:rPr>
-        <w:t>：</w:t>
-      </w:r>
-      <w:proofErr w:type="spellStart"/>
+        <w:t>图九：</w:t>
+      </w:r>
       <w:r>
         <w:rPr>
           <w:rFonts w:ascii="Times New Roman" w:eastAsia="SimSun" w:hAnsi="Times New Roman" w:cs="DengXian" w:hint="eastAsia"/>
@@ -7238,7 +7552,6 @@
         </w:rPr>
         <w:t>CNN+attention</w:t>
       </w:r>
-      <w:proofErr w:type="spellEnd"/>
       <w:r>
         <w:rPr>
           <w:rFonts w:ascii="Times New Roman" w:eastAsia="SimSun" w:hAnsi="Times New Roman" w:cs="DengXian" w:hint="eastAsia"/>
@@ -7255,7 +7568,7 @@
         <w:ind w:firstLine="420"/>
         <w:jc w:val="center"/>
         <w:rPr>
-          <w:rFonts w:ascii="Times New Roman" w:eastAsia="SimSun" w:hAnsi="Times New Roman" w:cs="DengXian" w:hint="eastAsia"/>
+          <w:rFonts w:ascii="Times New Roman" w:eastAsia="SimSun" w:hAnsi="Times New Roman" w:cs="DengXian"/>
           <w:kern w:val="0"/>
           <w:sz w:val="24"/>
           <w:szCs w:val="24"/>
@@ -7277,7 +7590,6 @@
           <w:szCs w:val="30"/>
         </w:rPr>
       </w:pPr>
-      <w:proofErr w:type="spellStart"/>
       <w:r>
         <w:rPr>
           <w:rFonts w:ascii="Times New Roman" w:eastAsia="SimSun" w:hAnsi="Times New Roman" w:cs="DengXian" w:hint="eastAsia"/>
@@ -7288,7 +7600,6 @@
         <w:lastRenderedPageBreak/>
         <w:t>ViT</w:t>
       </w:r>
-      <w:proofErr w:type="spellEnd"/>
     </w:p>
     <w:p>
       <w:pPr>
@@ -7302,7 +7613,6 @@
           <w:szCs w:val="24"/>
         </w:rPr>
       </w:pPr>
-      <w:proofErr w:type="spellStart"/>
       <w:r>
         <w:rPr>
           <w:rFonts w:ascii="Times New Roman" w:eastAsia="SimSun" w:hAnsi="Times New Roman" w:cs="DengXian" w:hint="eastAsia"/>
@@ -7312,7 +7622,6 @@
         </w:rPr>
         <w:t>ViT</w:t>
       </w:r>
-      <w:proofErr w:type="spellEnd"/>
       <w:r>
         <w:rPr>
           <w:rFonts w:ascii="Times New Roman" w:eastAsia="SimSun" w:hAnsi="Times New Roman" w:cs="DengXian" w:hint="eastAsia"/>
@@ -7376,7 +7685,6 @@
         </w:rPr>
         <w:t>步长”的处理类似。</w:t>
       </w:r>
-      <w:proofErr w:type="spellStart"/>
       <w:r>
         <w:rPr>
           <w:rFonts w:ascii="Times New Roman" w:eastAsia="SimSun" w:hAnsi="Times New Roman" w:cs="DengXian" w:hint="eastAsia"/>
@@ -7386,7 +7694,6 @@
         </w:rPr>
         <w:t>ViT</w:t>
       </w:r>
-      <w:proofErr w:type="spellEnd"/>
       <w:r>
         <w:rPr>
           <w:rFonts w:ascii="Times New Roman" w:eastAsia="SimSun" w:hAnsi="Times New Roman" w:cs="DengXian" w:hint="eastAsia"/>
@@ -7396,7 +7703,6 @@
         </w:rPr>
         <w:t>通过自注意力机制来聚合图片信息，与前面的</w:t>
       </w:r>
-      <w:proofErr w:type="spellStart"/>
       <w:r>
         <w:rPr>
           <w:rFonts w:ascii="Times New Roman" w:eastAsia="SimSun" w:hAnsi="Times New Roman" w:cs="DengXian" w:hint="eastAsia"/>
@@ -7406,7 +7712,6 @@
         </w:rPr>
         <w:t>CNN+attention</w:t>
       </w:r>
-      <w:proofErr w:type="spellEnd"/>
       <w:r>
         <w:rPr>
           <w:rFonts w:ascii="Times New Roman" w:eastAsia="SimSun" w:hAnsi="Times New Roman" w:cs="DengXian" w:hint="eastAsia"/>
@@ -7416,7 +7721,6 @@
         </w:rPr>
         <w:t>相比，</w:t>
       </w:r>
-      <w:proofErr w:type="spellStart"/>
       <w:r>
         <w:rPr>
           <w:rFonts w:ascii="Times New Roman" w:eastAsia="SimSun" w:hAnsi="Times New Roman" w:cs="DengXian" w:hint="eastAsia"/>
@@ -7426,7 +7730,6 @@
         </w:rPr>
         <w:t>ViT</w:t>
       </w:r>
-      <w:proofErr w:type="spellEnd"/>
       <w:r>
         <w:rPr>
           <w:rFonts w:ascii="Times New Roman" w:eastAsia="SimSun" w:hAnsi="Times New Roman" w:cs="DengXian" w:hint="eastAsia"/>
@@ -7521,7 +7824,7 @@
                     <pic:cNvPicPr/>
                   </pic:nvPicPr>
                   <pic:blipFill>
-                    <a:blip r:embed="rId15">
+                    <a:blip r:embed="rId17">
                       <a:extLst>
                         <a:ext uri="{28A0092B-C50C-407E-A947-70E740481C1C}">
                           <a14:useLocalDpi xmlns:a14="http://schemas.microsoft.com/office/drawing/2010/main" val="0"/>
@@ -7554,7 +7857,7 @@
         <w:ind w:firstLine="420"/>
         <w:jc w:val="center"/>
         <w:rPr>
-          <w:rFonts w:ascii="Times New Roman" w:eastAsia="SimSun" w:hAnsi="Times New Roman" w:cs="DengXian" w:hint="eastAsia"/>
+          <w:rFonts w:ascii="Times New Roman" w:eastAsia="SimSun" w:hAnsi="Times New Roman" w:cs="DengXian"/>
           <w:kern w:val="0"/>
           <w:sz w:val="24"/>
           <w:szCs w:val="24"/>
@@ -7567,27 +7870,8 @@
           <w:sz w:val="24"/>
           <w:szCs w:val="24"/>
         </w:rPr>
-        <w:t>图</w:t>
-      </w:r>
-      <w:r>
-        <w:rPr>
-          <w:rFonts w:ascii="Times New Roman" w:eastAsia="SimSun" w:hAnsi="Times New Roman" w:cs="DengXian" w:hint="eastAsia"/>
-          <w:kern w:val="0"/>
-          <w:sz w:val="24"/>
-          <w:szCs w:val="24"/>
-        </w:rPr>
-        <w:t>十</w:t>
-      </w:r>
-      <w:r>
-        <w:rPr>
-          <w:rFonts w:ascii="Times New Roman" w:eastAsia="SimSun" w:hAnsi="Times New Roman" w:cs="DengXian" w:hint="eastAsia"/>
-          <w:kern w:val="0"/>
-          <w:sz w:val="24"/>
-          <w:szCs w:val="24"/>
-        </w:rPr>
-        <w:t>：</w:t>
-      </w:r>
-      <w:proofErr w:type="spellStart"/>
+        <w:t>图十：</w:t>
+      </w:r>
       <w:r>
         <w:rPr>
           <w:rFonts w:ascii="Times New Roman" w:eastAsia="SimSun" w:hAnsi="Times New Roman" w:cs="DengXian" w:hint="eastAsia"/>
@@ -7597,7 +7881,6 @@
         </w:rPr>
         <w:t>ViT</w:t>
       </w:r>
-      <w:proofErr w:type="spellEnd"/>
       <w:r>
         <w:rPr>
           <w:rFonts w:ascii="Times New Roman" w:eastAsia="SimSun" w:hAnsi="Times New Roman" w:cs="DengXian" w:hint="eastAsia"/>
@@ -7620,7 +7903,6 @@
           <w:szCs w:val="24"/>
         </w:rPr>
       </w:pPr>
-      <w:proofErr w:type="spellStart"/>
       <w:r>
         <w:rPr>
           <w:rFonts w:ascii="Times New Roman" w:eastAsia="SimSun" w:hAnsi="Times New Roman" w:cs="DengXian" w:hint="eastAsia"/>
@@ -7630,7 +7912,6 @@
         </w:rPr>
         <w:t>ViT</w:t>
       </w:r>
-      <w:proofErr w:type="spellEnd"/>
       <w:r>
         <w:rPr>
           <w:rFonts w:ascii="Times New Roman" w:eastAsia="SimSun" w:hAnsi="Times New Roman" w:cs="DengXian" w:hint="eastAsia"/>
@@ -7676,25 +7957,14 @@
         </w:rPr>
         <w:t>序列，随后初始化一个</w:t>
       </w:r>
-      <w:proofErr w:type="spellStart"/>
-      <w:r>
-        <w:rPr>
-          <w:rFonts w:ascii="Times New Roman" w:eastAsia="SimSun" w:hAnsi="Times New Roman" w:cs="DengXian" w:hint="eastAsia"/>
-          <w:kern w:val="0"/>
-          <w:sz w:val="24"/>
-          <w:szCs w:val="24"/>
-        </w:rPr>
-        <w:t>cls</w:t>
-      </w:r>
-      <w:proofErr w:type="spellEnd"/>
-      <w:r>
-        <w:rPr>
-          <w:rFonts w:ascii="Times New Roman" w:eastAsia="SimSun" w:hAnsi="Times New Roman" w:cs="DengXian" w:hint="eastAsia"/>
-          <w:kern w:val="0"/>
-          <w:sz w:val="24"/>
-          <w:szCs w:val="24"/>
-        </w:rPr>
-        <w:t xml:space="preserve"> token</w:t>
+      <w:r>
+        <w:rPr>
+          <w:rFonts w:ascii="Times New Roman" w:eastAsia="SimSun" w:hAnsi="Times New Roman" w:cs="DengXian" w:hint="eastAsia"/>
+          <w:kern w:val="0"/>
+          <w:sz w:val="24"/>
+          <w:szCs w:val="24"/>
+        </w:rPr>
+        <w:t>cls token</w:t>
       </w:r>
       <w:r>
         <w:rPr>
@@ -7957,25 +8227,14 @@
         </w:rPr>
         <w:t>都包含有全局信息，将</w:t>
       </w:r>
-      <w:proofErr w:type="spellStart"/>
-      <w:r>
-        <w:rPr>
-          <w:rFonts w:ascii="Times New Roman" w:eastAsia="SimSun" w:hAnsi="Times New Roman" w:cs="DengXian" w:hint="eastAsia"/>
-          <w:kern w:val="0"/>
-          <w:sz w:val="24"/>
-          <w:szCs w:val="24"/>
-        </w:rPr>
-        <w:t>cls</w:t>
-      </w:r>
-      <w:proofErr w:type="spellEnd"/>
-      <w:r>
-        <w:rPr>
-          <w:rFonts w:ascii="Times New Roman" w:eastAsia="SimSun" w:hAnsi="Times New Roman" w:cs="DengXian" w:hint="eastAsia"/>
-          <w:kern w:val="0"/>
-          <w:sz w:val="24"/>
-          <w:szCs w:val="24"/>
-        </w:rPr>
-        <w:t xml:space="preserve"> token</w:t>
+      <w:r>
+        <w:rPr>
+          <w:rFonts w:ascii="Times New Roman" w:eastAsia="SimSun" w:hAnsi="Times New Roman" w:cs="DengXian" w:hint="eastAsia"/>
+          <w:kern w:val="0"/>
+          <w:sz w:val="24"/>
+          <w:szCs w:val="24"/>
+        </w:rPr>
+        <w:t>cls token</w:t>
       </w:r>
       <w:r>
         <w:rPr>
@@ -8013,7 +8272,6 @@
         </w:rPr>
         <w:t>依赖降采样池化来扩大感受野相比，</w:t>
       </w:r>
-      <w:proofErr w:type="spellStart"/>
       <w:r>
         <w:rPr>
           <w:rFonts w:ascii="Times New Roman" w:eastAsia="SimSun" w:hAnsi="Times New Roman" w:cs="DengXian" w:hint="eastAsia"/>
@@ -8023,7 +8281,6 @@
         </w:rPr>
         <w:t>ViT</w:t>
       </w:r>
-      <w:proofErr w:type="spellEnd"/>
       <w:r>
         <w:rPr>
           <w:rFonts w:ascii="Times New Roman" w:eastAsia="SimSun" w:hAnsi="Times New Roman" w:cs="DengXian" w:hint="eastAsia"/>
@@ -8145,7 +8402,6 @@
         </w:rPr>
         <w:t>然而在实际训练过程中，由于数据集较小，</w:t>
       </w:r>
-      <w:proofErr w:type="spellStart"/>
       <w:r>
         <w:rPr>
           <w:rFonts w:ascii="Times New Roman" w:eastAsia="SimSun" w:hAnsi="Times New Roman" w:cs="DengXian" w:hint="eastAsia"/>
@@ -8155,7 +8411,6 @@
         </w:rPr>
         <w:t>ViT</w:t>
       </w:r>
-      <w:proofErr w:type="spellEnd"/>
       <w:r>
         <w:rPr>
           <w:rFonts w:ascii="Times New Roman" w:eastAsia="SimSun" w:hAnsi="Times New Roman" w:cs="DengXian" w:hint="eastAsia"/>
@@ -8201,25 +8456,14 @@
         </w:rPr>
         <w:t>仍在稳定下降，但</w:t>
       </w:r>
-      <w:proofErr w:type="spellStart"/>
-      <w:r>
-        <w:rPr>
-          <w:rFonts w:ascii="Times New Roman" w:eastAsia="SimSun" w:hAnsi="Times New Roman" w:cs="DengXian" w:hint="eastAsia"/>
-          <w:kern w:val="0"/>
-          <w:sz w:val="24"/>
-          <w:szCs w:val="24"/>
-        </w:rPr>
-        <w:t>val</w:t>
-      </w:r>
-      <w:proofErr w:type="spellEnd"/>
-      <w:r>
-        <w:rPr>
-          <w:rFonts w:ascii="Times New Roman" w:eastAsia="SimSun" w:hAnsi="Times New Roman" w:cs="DengXian" w:hint="eastAsia"/>
-          <w:kern w:val="0"/>
-          <w:sz w:val="24"/>
-          <w:szCs w:val="24"/>
-        </w:rPr>
-        <w:t xml:space="preserve"> loss</w:t>
+      <w:r>
+        <w:rPr>
+          <w:rFonts w:ascii="Times New Roman" w:eastAsia="SimSun" w:hAnsi="Times New Roman" w:cs="DengXian" w:hint="eastAsia"/>
+          <w:kern w:val="0"/>
+          <w:sz w:val="24"/>
+          <w:szCs w:val="24"/>
+        </w:rPr>
+        <w:t>val loss</w:t>
       </w:r>
       <w:r>
         <w:rPr>
@@ -8264,7 +8508,7 @@
                     <pic:cNvPicPr/>
                   </pic:nvPicPr>
                   <pic:blipFill rotWithShape="1">
-                    <a:blip r:embed="rId16"/>
+                    <a:blip r:embed="rId18"/>
                     <a:srcRect b="63550"/>
                     <a:stretch>
                       <a:fillRect/>
@@ -8313,7 +8557,7 @@
                     <pic:cNvPicPr/>
                   </pic:nvPicPr>
                   <pic:blipFill rotWithShape="1">
-                    <a:blip r:embed="rId16"/>
+                    <a:blip r:embed="rId18"/>
                     <a:srcRect t="58223" b="5616"/>
                     <a:stretch>
                       <a:fillRect/>
@@ -8364,7 +8608,6 @@
         </w:rPr>
         <w:t>图十一：</w:t>
       </w:r>
-      <w:proofErr w:type="spellStart"/>
       <w:r>
         <w:rPr>
           <w:rFonts w:ascii="Times New Roman" w:eastAsia="SimSun" w:hAnsi="Times New Roman" w:cs="DengXian" w:hint="eastAsia"/>
@@ -8374,7 +8617,6 @@
         </w:rPr>
         <w:t>ViT</w:t>
       </w:r>
-      <w:proofErr w:type="spellEnd"/>
       <w:r>
         <w:rPr>
           <w:rFonts w:ascii="Times New Roman" w:eastAsia="SimSun" w:hAnsi="Times New Roman" w:cs="DengXian" w:hint="eastAsia"/>
@@ -8424,7 +8666,6 @@
         </w:rPr>
         <w:t>下表为</w:t>
       </w:r>
-      <w:proofErr w:type="spellStart"/>
       <w:r>
         <w:rPr>
           <w:rFonts w:ascii="Times New Roman" w:eastAsia="SimSun" w:hAnsi="Times New Roman" w:cs="DengXian" w:hint="eastAsia"/>
@@ -8434,7 +8675,6 @@
         </w:rPr>
         <w:t>ViT</w:t>
       </w:r>
-      <w:proofErr w:type="spellEnd"/>
       <w:r>
         <w:rPr>
           <w:rFonts w:ascii="Times New Roman" w:eastAsia="SimSun" w:hAnsi="Times New Roman" w:cs="DengXian" w:hint="eastAsia"/>
@@ -8462,7 +8702,6 @@
         </w:rPr>
         <w:t>。如图十二所示是</w:t>
       </w:r>
-      <w:proofErr w:type="spellStart"/>
       <w:r>
         <w:rPr>
           <w:rFonts w:ascii="Times New Roman" w:eastAsia="SimSun" w:hAnsi="Times New Roman" w:cs="DengXian" w:hint="eastAsia"/>
@@ -8472,7 +8711,6 @@
         </w:rPr>
         <w:t>ViT</w:t>
       </w:r>
-      <w:proofErr w:type="spellEnd"/>
       <w:r>
         <w:rPr>
           <w:rFonts w:ascii="Times New Roman" w:eastAsia="SimSun" w:hAnsi="Times New Roman" w:cs="DengXian" w:hint="eastAsia"/>
@@ -8565,23 +8803,21 @@
               <w:ind w:firstLine="420"/>
               <w:jc w:val="center"/>
               <w:rPr>
+                <w:rFonts w:ascii="Times New Roman" w:eastAsia="SimSun" w:hAnsi="Times New Roman" w:cs="DengXian"/>
+                <w:kern w:val="0"/>
+                <w:sz w:val="24"/>
+                <w:szCs w:val="24"/>
+              </w:rPr>
+            </w:pPr>
+            <w:r>
+              <w:rPr>
                 <w:rFonts w:ascii="Times New Roman" w:eastAsia="SimSun" w:hAnsi="Times New Roman" w:cs="DengXian" w:hint="eastAsia"/>
                 <w:kern w:val="0"/>
                 <w:sz w:val="24"/>
                 <w:szCs w:val="24"/>
               </w:rPr>
-            </w:pPr>
-            <w:proofErr w:type="spellStart"/>
-            <w:r>
-              <w:rPr>
-                <w:rFonts w:ascii="Times New Roman" w:eastAsia="SimSun" w:hAnsi="Times New Roman" w:cs="DengXian" w:hint="eastAsia"/>
-                <w:kern w:val="0"/>
-                <w:sz w:val="24"/>
-                <w:szCs w:val="24"/>
-              </w:rPr>
               <w:t>ViT</w:t>
             </w:r>
-            <w:proofErr w:type="spellEnd"/>
           </w:p>
         </w:tc>
       </w:tr>
@@ -8616,7 +8852,6 @@
                 <w:szCs w:val="24"/>
               </w:rPr>
             </w:pPr>
-            <w:proofErr w:type="spellStart"/>
             <w:r>
               <w:rPr>
                 <w:rFonts w:ascii="Times New Roman" w:eastAsia="SimSun" w:hAnsi="Times New Roman" w:cs="DengXian"/>
@@ -8628,7 +8863,6 @@
               </w:rPr>
               <w:t>val_acc</w:t>
             </w:r>
-            <w:proofErr w:type="spellEnd"/>
           </w:p>
         </w:tc>
         <w:tc>
@@ -8667,29 +8901,7 @@
                 <w:sz w:val="24"/>
                 <w:szCs w:val="24"/>
               </w:rPr>
-              <w:t>74</w:t>
-            </w:r>
-            <w:r>
-              <w:rPr>
-                <w:rFonts w:ascii="Times New Roman" w:eastAsia="SimSun" w:hAnsi="Times New Roman" w:cs="DengXian" w:hint="eastAsia"/>
-                <w:b/>
-                <w:bCs/>
-                <w:kern w:val="0"/>
-                <w:sz w:val="24"/>
-                <w:szCs w:val="24"/>
-              </w:rPr>
-              <w:t>.</w:t>
-            </w:r>
-            <w:r>
-              <w:rPr>
-                <w:rFonts w:ascii="Times New Roman" w:eastAsia="SimSun" w:hAnsi="Times New Roman" w:cs="DengXian" w:hint="eastAsia"/>
-                <w:b/>
-                <w:bCs/>
-                <w:kern w:val="0"/>
-                <w:sz w:val="24"/>
-                <w:szCs w:val="24"/>
-              </w:rPr>
-              <w:t>00</w:t>
+              <w:t>74.00</w:t>
             </w:r>
             <w:r>
               <w:rPr>
@@ -8733,7 +8945,6 @@
                 <w:szCs w:val="24"/>
               </w:rPr>
             </w:pPr>
-            <w:proofErr w:type="spellStart"/>
             <w:r>
               <w:rPr>
                 <w:rFonts w:ascii="Times New Roman" w:eastAsia="SimSun" w:hAnsi="Times New Roman" w:cs="DengXian"/>
@@ -8743,7 +8954,6 @@
               </w:rPr>
               <w:t>val_loss</w:t>
             </w:r>
-            <w:proofErr w:type="spellEnd"/>
           </w:p>
         </w:tc>
         <w:tc>
@@ -8764,7 +8974,7 @@
               <w:ind w:firstLine="420"/>
               <w:jc w:val="center"/>
               <w:rPr>
-                <w:rFonts w:ascii="Times New Roman" w:eastAsia="SimSun" w:hAnsi="Times New Roman" w:cs="DengXian" w:hint="eastAsia"/>
+                <w:rFonts w:ascii="Times New Roman" w:eastAsia="SimSun" w:hAnsi="Times New Roman" w:cs="DengXian"/>
                 <w:kern w:val="0"/>
                 <w:sz w:val="24"/>
                 <w:szCs w:val="24"/>
@@ -8819,7 +9029,6 @@
                 <w:szCs w:val="24"/>
               </w:rPr>
             </w:pPr>
-            <w:proofErr w:type="spellStart"/>
             <w:r>
               <w:rPr>
                 <w:rFonts w:ascii="Times New Roman" w:eastAsia="SimSun" w:hAnsi="Times New Roman" w:cs="DengXian"/>
@@ -8829,7 +9038,6 @@
               </w:rPr>
               <w:t>lr</w:t>
             </w:r>
-            <w:proofErr w:type="spellEnd"/>
           </w:p>
         </w:tc>
         <w:tc>
@@ -8850,7 +9058,7 @@
               <w:ind w:firstLine="420"/>
               <w:jc w:val="center"/>
               <w:rPr>
-                <w:rFonts w:ascii="Times New Roman" w:eastAsia="SimSun" w:hAnsi="Times New Roman" w:cs="DengXian" w:hint="eastAsia"/>
+                <w:rFonts w:ascii="Times New Roman" w:eastAsia="SimSun" w:hAnsi="Times New Roman" w:cs="DengXian"/>
                 <w:kern w:val="0"/>
                 <w:sz w:val="24"/>
                 <w:szCs w:val="24"/>
@@ -8920,7 +9128,6 @@
                 <w:szCs w:val="24"/>
               </w:rPr>
             </w:pPr>
-            <w:proofErr w:type="spellStart"/>
             <w:r>
               <w:rPr>
                 <w:rFonts w:ascii="Times New Roman" w:eastAsia="SimSun" w:hAnsi="Times New Roman" w:cs="DengXian"/>
@@ -8930,7 +9137,6 @@
               </w:rPr>
               <w:t>weight_decay</w:t>
             </w:r>
-            <w:proofErr w:type="spellEnd"/>
           </w:p>
         </w:tc>
         <w:tc>
@@ -8951,7 +9157,7 @@
               <w:ind w:firstLine="420"/>
               <w:jc w:val="center"/>
               <w:rPr>
-                <w:rFonts w:ascii="Times New Roman" w:eastAsia="SimSun" w:hAnsi="Times New Roman" w:cs="DengXian" w:hint="eastAsia"/>
+                <w:rFonts w:ascii="Times New Roman" w:eastAsia="SimSun" w:hAnsi="Times New Roman" w:cs="DengXian"/>
                 <w:kern w:val="0"/>
                 <w:sz w:val="24"/>
                 <w:szCs w:val="24"/>
@@ -8966,29 +9172,7 @@
                 <w:sz w:val="24"/>
                 <w:szCs w:val="24"/>
               </w:rPr>
-              <w:t>1.</w:t>
-            </w:r>
-            <w:r>
-              <w:rPr>
-                <w:rFonts w:ascii="Times New Roman" w:eastAsia="SimSun" w:hAnsi="Times New Roman" w:cs="DengXian" w:hint="eastAsia"/>
-                <w:b/>
-                <w:bCs/>
-                <w:kern w:val="0"/>
-                <w:sz w:val="24"/>
-                <w:szCs w:val="24"/>
-              </w:rPr>
-              <w:t>31</w:t>
-            </w:r>
-            <w:r>
-              <w:rPr>
-                <w:rFonts w:ascii="Times New Roman" w:eastAsia="SimSun" w:hAnsi="Times New Roman" w:cs="DengXian" w:hint="eastAsia"/>
-                <w:b/>
-                <w:bCs/>
-                <w:kern w:val="0"/>
-                <w:sz w:val="24"/>
-                <w:szCs w:val="24"/>
-              </w:rPr>
-              <w:t>e-04</w:t>
+              <w:t>1.31e-04</w:t>
             </w:r>
           </w:p>
         </w:tc>
@@ -9050,7 +9234,7 @@
               <w:ind w:firstLine="420"/>
               <w:jc w:val="center"/>
               <w:rPr>
-                <w:rFonts w:ascii="Times New Roman" w:eastAsia="SimSun" w:hAnsi="Times New Roman" w:cs="DengXian" w:hint="eastAsia"/>
+                <w:rFonts w:ascii="Times New Roman" w:eastAsia="SimSun" w:hAnsi="Times New Roman" w:cs="DengXian"/>
                 <w:kern w:val="0"/>
                 <w:sz w:val="24"/>
                 <w:szCs w:val="24"/>
@@ -9109,7 +9293,6 @@
                 <w:szCs w:val="24"/>
               </w:rPr>
             </w:pPr>
-            <w:proofErr w:type="spellStart"/>
             <w:r>
               <w:rPr>
                 <w:rFonts w:ascii="Times New Roman" w:eastAsia="SimSun" w:hAnsi="Times New Roman" w:cs="DengXian"/>
@@ -9119,7 +9302,6 @@
               </w:rPr>
               <w:t>batch_size</w:t>
             </w:r>
-            <w:proofErr w:type="spellEnd"/>
           </w:p>
         </w:tc>
         <w:tc>
@@ -9140,7 +9322,7 @@
               <w:ind w:firstLine="420"/>
               <w:jc w:val="center"/>
               <w:rPr>
-                <w:rFonts w:ascii="Times New Roman" w:eastAsia="SimSun" w:hAnsi="Times New Roman" w:cs="DengXian" w:hint="eastAsia"/>
+                <w:rFonts w:ascii="Times New Roman" w:eastAsia="SimSun" w:hAnsi="Times New Roman" w:cs="DengXian"/>
                 <w:kern w:val="0"/>
                 <w:sz w:val="24"/>
                 <w:szCs w:val="24"/>
@@ -9227,65 +9409,14 @@
                 <w:szCs w:val="24"/>
               </w:rPr>
             </w:pPr>
-            <w:proofErr w:type="spellStart"/>
-            <w:r>
-              <w:rPr>
-                <w:rFonts w:ascii="Times New Roman" w:eastAsia="SimSun" w:hAnsi="Times New Roman" w:cs="DengXian"/>
-                <w:kern w:val="0"/>
-                <w:sz w:val="24"/>
-                <w:szCs w:val="24"/>
-              </w:rPr>
-              <w:t>embed_dim</w:t>
-            </w:r>
-            <w:proofErr w:type="spellEnd"/>
-            <w:r>
-              <w:rPr>
-                <w:rFonts w:ascii="Times New Roman" w:eastAsia="SimSun" w:hAnsi="Times New Roman" w:cs="DengXian"/>
-                <w:kern w:val="0"/>
-                <w:sz w:val="24"/>
-                <w:szCs w:val="24"/>
-              </w:rPr>
-              <w:t xml:space="preserve"> 128, depth 8, </w:t>
-            </w:r>
-            <w:proofErr w:type="spellStart"/>
-            <w:r>
-              <w:rPr>
-                <w:rFonts w:ascii="Times New Roman" w:eastAsia="SimSun" w:hAnsi="Times New Roman" w:cs="DengXian"/>
-                <w:kern w:val="0"/>
-                <w:sz w:val="24"/>
-                <w:szCs w:val="24"/>
-              </w:rPr>
-              <w:t>num_heads</w:t>
-            </w:r>
-            <w:proofErr w:type="spellEnd"/>
-            <w:r>
-              <w:rPr>
-                <w:rFonts w:ascii="Times New Roman" w:eastAsia="SimSun" w:hAnsi="Times New Roman" w:cs="DengXian"/>
-                <w:kern w:val="0"/>
-                <w:sz w:val="24"/>
-                <w:szCs w:val="24"/>
-              </w:rPr>
-              <w:t xml:space="preserve"> 4, </w:t>
-            </w:r>
-            <w:proofErr w:type="spellStart"/>
-            <w:r>
-              <w:rPr>
-                <w:rFonts w:ascii="Times New Roman" w:eastAsia="SimSun" w:hAnsi="Times New Roman" w:cs="DengXian"/>
-                <w:kern w:val="0"/>
-                <w:sz w:val="24"/>
-                <w:szCs w:val="24"/>
-              </w:rPr>
-              <w:t>patch_size</w:t>
-            </w:r>
-            <w:proofErr w:type="spellEnd"/>
-            <w:r>
-              <w:rPr>
-                <w:rFonts w:ascii="Times New Roman" w:eastAsia="SimSun" w:hAnsi="Times New Roman" w:cs="DengXian"/>
-                <w:kern w:val="0"/>
-                <w:sz w:val="24"/>
-                <w:szCs w:val="24"/>
-              </w:rPr>
-              <w:t xml:space="preserve"> 16</w:t>
+            <w:r>
+              <w:rPr>
+                <w:rFonts w:ascii="Times New Roman" w:eastAsia="SimSun" w:hAnsi="Times New Roman" w:cs="DengXian"/>
+                <w:kern w:val="0"/>
+                <w:sz w:val="24"/>
+                <w:szCs w:val="24"/>
+              </w:rPr>
+              <w:t>embed_dim 128, depth 8, num_heads 4, patch_size 16</w:t>
             </w:r>
           </w:p>
         </w:tc>
@@ -9312,7 +9443,6 @@
         </w:rPr>
         <w:t>表五：</w:t>
       </w:r>
-      <w:proofErr w:type="spellStart"/>
       <w:r>
         <w:rPr>
           <w:rFonts w:ascii="Times New Roman" w:eastAsia="SimSun" w:hAnsi="Times New Roman" w:cs="DengXian" w:hint="eastAsia"/>
@@ -9322,7 +9452,6 @@
         </w:rPr>
         <w:t>ViT</w:t>
       </w:r>
-      <w:proofErr w:type="spellEnd"/>
       <w:r>
         <w:rPr>
           <w:rFonts w:ascii="Times New Roman" w:eastAsia="SimSun" w:hAnsi="Times New Roman" w:cs="DengXian" w:hint="eastAsia"/>
@@ -9364,7 +9493,7 @@
                     <pic:cNvPicPr/>
                   </pic:nvPicPr>
                   <pic:blipFill>
-                    <a:blip r:embed="rId17">
+                    <a:blip r:embed="rId19">
                       <a:extLst>
                         <a:ext uri="{28A0092B-C50C-407E-A947-70E740481C1C}">
                           <a14:useLocalDpi xmlns:a14="http://schemas.microsoft.com/office/drawing/2010/main" val="0"/>
@@ -9397,7 +9526,7 @@
         <w:ind w:firstLine="420"/>
         <w:jc w:val="center"/>
         <w:rPr>
-          <w:rFonts w:ascii="Times New Roman" w:eastAsia="SimSun" w:hAnsi="Times New Roman" w:cs="DengXian" w:hint="eastAsia"/>
+          <w:rFonts w:ascii="Times New Roman" w:eastAsia="SimSun" w:hAnsi="Times New Roman" w:cs="DengXian"/>
           <w:kern w:val="0"/>
           <w:sz w:val="24"/>
           <w:szCs w:val="24"/>
@@ -9410,27 +9539,8 @@
           <w:sz w:val="24"/>
           <w:szCs w:val="24"/>
         </w:rPr>
-        <w:t>图十</w:t>
-      </w:r>
-      <w:r>
-        <w:rPr>
-          <w:rFonts w:ascii="Times New Roman" w:eastAsia="SimSun" w:hAnsi="Times New Roman" w:cs="DengXian" w:hint="eastAsia"/>
-          <w:kern w:val="0"/>
-          <w:sz w:val="24"/>
-          <w:szCs w:val="24"/>
-        </w:rPr>
-        <w:t>二</w:t>
-      </w:r>
-      <w:r>
-        <w:rPr>
-          <w:rFonts w:ascii="Times New Roman" w:eastAsia="SimSun" w:hAnsi="Times New Roman" w:cs="DengXian" w:hint="eastAsia"/>
-          <w:kern w:val="0"/>
-          <w:sz w:val="24"/>
-          <w:szCs w:val="24"/>
-        </w:rPr>
-        <w:t>：</w:t>
-      </w:r>
-      <w:proofErr w:type="spellStart"/>
+        <w:t>图十二：</w:t>
+      </w:r>
       <w:r>
         <w:rPr>
           <w:rFonts w:ascii="Times New Roman" w:eastAsia="SimSun" w:hAnsi="Times New Roman" w:cs="DengXian" w:hint="eastAsia"/>
@@ -9440,7 +9550,6 @@
         </w:rPr>
         <w:t>ViT</w:t>
       </w:r>
-      <w:proofErr w:type="spellEnd"/>
       <w:r>
         <w:rPr>
           <w:rFonts w:ascii="Times New Roman" w:eastAsia="SimSun" w:hAnsi="Times New Roman" w:cs="DengXian" w:hint="eastAsia"/>
@@ -9466,6 +9575,64 @@
     </w:sectPr>
   </w:body>
 </w:document>
+</file>
+
+<file path=word/endnotes.xml><?xml version="1.0" encoding="utf-8"?>
+<w:endnotes xmlns:wpc="http://schemas.microsoft.com/office/word/2010/wordprocessingCanvas" xmlns:cx="http://schemas.microsoft.com/office/drawing/2014/chartex" xmlns:cx1="http://schemas.microsoft.com/office/drawing/2015/9/8/chartex" xmlns:cx2="http://schemas.microsoft.com/office/drawing/2015/10/21/chartex" xmlns:cx3="http://schemas.microsoft.com/office/drawing/2016/5/9/chartex" xmlns:cx4="http://schemas.microsoft.com/office/drawing/2016/5/10/chartex" xmlns:cx5="http://schemas.microsoft.com/office/drawing/2016/5/11/chartex" xmlns:cx6="http://schemas.microsoft.com/office/drawing/2016/5/12/chartex" xmlns:cx7="http://schemas.microsoft.com/office/drawing/2016/5/13/chartex" xmlns:cx8="http://schemas.microsoft.com/office/drawing/2016/5/14/chartex" xmlns:mc="http://schemas.openxmlformats.org/markup-compatibility/2006" xmlns:aink="http://schemas.microsoft.com/office/drawing/2016/ink" xmlns:am3d="http://schemas.microsoft.com/office/drawing/2017/model3d" xmlns:o="urn:schemas-microsoft-com:office:office" xmlns:oel="http://schemas.microsoft.com/office/2019/extlst" xmlns:r="http://schemas.openxmlformats.org/officeDocument/2006/relationships" xmlns:m="http://schemas.openxmlformats.org/officeDocument/2006/math" xmlns:v="urn:schemas-microsoft-com:vml" xmlns:wp14="http://schemas.microsoft.com/office/word/2010/wordprocessingDrawing" xmlns:wp="http://schemas.openxmlformats.org/drawingml/2006/wordprocessingDrawing" xmlns:w10="urn:schemas-microsoft-com:office:word" xmlns:w="http://schemas.openxmlformats.org/wordprocessingml/2006/main" xmlns:w14="http://schemas.microsoft.com/office/word/2010/wordml" xmlns:w15="http://schemas.microsoft.com/office/word/2012/wordml" xmlns:w16cex="http://schemas.microsoft.com/office/word/2018/wordml/cex" xmlns:w16cid="http://schemas.microsoft.com/office/word/2016/wordml/cid" xmlns:w16="http://schemas.microsoft.com/office/word/2018/wordml" xmlns:w16du="http://schemas.microsoft.com/office/word/2023/wordml/word16du" xmlns:w16sdtdh="http://schemas.microsoft.com/office/word/2020/wordml/sdtdatahash" xmlns:w16sdtfl="http://schemas.microsoft.com/office/word/2024/wordml/sdtformatlock" xmlns:w16se="http://schemas.microsoft.com/office/word/2015/wordml/symex" xmlns:wpg="http://schemas.microsoft.com/office/word/2010/wordprocessingGroup" xmlns:wpi="http://schemas.microsoft.com/office/word/2010/wordprocessingInk" xmlns:wne="http://schemas.microsoft.com/office/word/2006/wordml" xmlns:wps="http://schemas.microsoft.com/office/word/2010/wordprocessingShape" mc:Ignorable="w14 w15 w16se w16cid w16 w16cex w16sdtdh w16sdtfl w16du wp14">
+  <w:endnote w:type="separator" w:id="-1">
+    <w:p>
+      <w:pPr>
+        <w:rPr>
+          <w:rFonts w:hint="eastAsia"/>
+        </w:rPr>
+      </w:pPr>
+      <w:r>
+        <w:separator/>
+      </w:r>
+    </w:p>
+  </w:endnote>
+  <w:endnote w:type="continuationSeparator" w:id="0">
+    <w:p>
+      <w:pPr>
+        <w:rPr>
+          <w:rFonts w:hint="eastAsia"/>
+        </w:rPr>
+      </w:pPr>
+      <w:r>
+        <w:continuationSeparator/>
+      </w:r>
+    </w:p>
+  </w:endnote>
+</w:endnotes>
+</file>
+
+<file path=word/footnotes.xml><?xml version="1.0" encoding="utf-8"?>
+<w:footnotes xmlns:wpc="http://schemas.microsoft.com/office/word/2010/wordprocessingCanvas" xmlns:cx="http://schemas.microsoft.com/office/drawing/2014/chartex" xmlns:cx1="http://schemas.microsoft.com/office/drawing/2015/9/8/chartex" xmlns:cx2="http://schemas.microsoft.com/office/drawing/2015/10/21/chartex" xmlns:cx3="http://schemas.microsoft.com/office/drawing/2016/5/9/chartex" xmlns:cx4="http://schemas.microsoft.com/office/drawing/2016/5/10/chartex" xmlns:cx5="http://schemas.microsoft.com/office/drawing/2016/5/11/chartex" xmlns:cx6="http://schemas.microsoft.com/office/drawing/2016/5/12/chartex" xmlns:cx7="http://schemas.microsoft.com/office/drawing/2016/5/13/chartex" xmlns:cx8="http://schemas.microsoft.com/office/drawing/2016/5/14/chartex" xmlns:mc="http://schemas.openxmlformats.org/markup-compatibility/2006" xmlns:aink="http://schemas.microsoft.com/office/drawing/2016/ink" xmlns:am3d="http://schemas.microsoft.com/office/drawing/2017/model3d" xmlns:o="urn:schemas-microsoft-com:office:office" xmlns:oel="http://schemas.microsoft.com/office/2019/extlst" xmlns:r="http://schemas.openxmlformats.org/officeDocument/2006/relationships" xmlns:m="http://schemas.openxmlformats.org/officeDocument/2006/math" xmlns:v="urn:schemas-microsoft-com:vml" xmlns:wp14="http://schemas.microsoft.com/office/word/2010/wordprocessingDrawing" xmlns:wp="http://schemas.openxmlformats.org/drawingml/2006/wordprocessingDrawing" xmlns:w10="urn:schemas-microsoft-com:office:word" xmlns:w="http://schemas.openxmlformats.org/wordprocessingml/2006/main" xmlns:w14="http://schemas.microsoft.com/office/word/2010/wordml" xmlns:w15="http://schemas.microsoft.com/office/word/2012/wordml" xmlns:w16cex="http://schemas.microsoft.com/office/word/2018/wordml/cex" xmlns:w16cid="http://schemas.microsoft.com/office/word/2016/wordml/cid" xmlns:w16="http://schemas.microsoft.com/office/word/2018/wordml" xmlns:w16du="http://schemas.microsoft.com/office/word/2023/wordml/word16du" xmlns:w16sdtdh="http://schemas.microsoft.com/office/word/2020/wordml/sdtdatahash" xmlns:w16sdtfl="http://schemas.microsoft.com/office/word/2024/wordml/sdtformatlock" xmlns:w16se="http://schemas.microsoft.com/office/word/2015/wordml/symex" xmlns:wpg="http://schemas.microsoft.com/office/word/2010/wordprocessingGroup" xmlns:wpi="http://schemas.microsoft.com/office/word/2010/wordprocessingInk" xmlns:wne="http://schemas.microsoft.com/office/word/2006/wordml" xmlns:wps="http://schemas.microsoft.com/office/word/2010/wordprocessingShape" mc:Ignorable="w14 w15 w16se w16cid w16 w16cex w16sdtdh w16sdtfl w16du wp14">
+  <w:footnote w:type="separator" w:id="-1">
+    <w:p>
+      <w:pPr>
+        <w:rPr>
+          <w:rFonts w:hint="eastAsia"/>
+        </w:rPr>
+      </w:pPr>
+      <w:r>
+        <w:separator/>
+      </w:r>
+    </w:p>
+  </w:footnote>
+  <w:footnote w:type="continuationSeparator" w:id="0">
+    <w:p>
+      <w:pPr>
+        <w:rPr>
+          <w:rFonts w:hint="eastAsia"/>
+        </w:rPr>
+      </w:pPr>
+      <w:r>
+        <w:continuationSeparator/>
+      </w:r>
+    </w:p>
+  </w:footnote>
+</w:footnotes>
 </file>
 
 <file path=word/numbering.xml><?xml version="1.0" encoding="utf-8"?>
@@ -10509,6 +10676,91 @@
       <w:spacing w:val="5"/>
     </w:rPr>
   </w:style>
+  <w:style w:type="paragraph" w:styleId="ae">
+    <w:name w:val="header"/>
+    <w:basedOn w:val="a"/>
+    <w:link w:val="af"/>
+    <w:uiPriority w:val="99"/>
+    <w:unhideWhenUsed/>
+    <w:rsid w:val="00350E93"/>
+    <w:pPr>
+      <w:tabs>
+        <w:tab w:val="center" w:pos="4513"/>
+        <w:tab w:val="right" w:pos="9026"/>
+      </w:tabs>
+      <w:snapToGrid w:val="0"/>
+      <w:jc w:val="center"/>
+    </w:pPr>
+    <w:rPr>
+      <w:sz w:val="18"/>
+      <w:szCs w:val="18"/>
+    </w:rPr>
+  </w:style>
+  <w:style w:type="character" w:customStyle="1" w:styleId="af">
+    <w:name w:val="页眉 字符"/>
+    <w:basedOn w:val="a0"/>
+    <w:link w:val="ae"/>
+    <w:uiPriority w:val="99"/>
+    <w:rsid w:val="00350E93"/>
+    <w:rPr>
+      <w:sz w:val="18"/>
+      <w:szCs w:val="18"/>
+    </w:rPr>
+  </w:style>
+  <w:style w:type="paragraph" w:styleId="af0">
+    <w:name w:val="footer"/>
+    <w:basedOn w:val="a"/>
+    <w:link w:val="af1"/>
+    <w:uiPriority w:val="99"/>
+    <w:unhideWhenUsed/>
+    <w:rsid w:val="00350E93"/>
+    <w:pPr>
+      <w:tabs>
+        <w:tab w:val="center" w:pos="4513"/>
+        <w:tab w:val="right" w:pos="9026"/>
+      </w:tabs>
+      <w:snapToGrid w:val="0"/>
+      <w:jc w:val="left"/>
+    </w:pPr>
+    <w:rPr>
+      <w:sz w:val="18"/>
+      <w:szCs w:val="18"/>
+    </w:rPr>
+  </w:style>
+  <w:style w:type="character" w:customStyle="1" w:styleId="af1">
+    <w:name w:val="页脚 字符"/>
+    <w:basedOn w:val="a0"/>
+    <w:link w:val="af0"/>
+    <w:uiPriority w:val="99"/>
+    <w:rsid w:val="00350E93"/>
+    <w:rPr>
+      <w:sz w:val="18"/>
+      <w:szCs w:val="18"/>
+    </w:rPr>
+  </w:style>
+  <w:style w:type="character" w:styleId="af2">
+    <w:name w:val="Hyperlink"/>
+    <w:basedOn w:val="a0"/>
+    <w:uiPriority w:val="99"/>
+    <w:unhideWhenUsed/>
+    <w:rsid w:val="004D36C1"/>
+    <w:rPr>
+      <w:color w:val="467886" w:themeColor="hyperlink"/>
+      <w:u w:val="single"/>
+    </w:rPr>
+  </w:style>
+  <w:style w:type="character" w:styleId="af3">
+    <w:name w:val="Unresolved Mention"/>
+    <w:basedOn w:val="a0"/>
+    <w:uiPriority w:val="99"/>
+    <w:semiHidden/>
+    <w:unhideWhenUsed/>
+    <w:rsid w:val="004D36C1"/>
+    <w:rPr>
+      <w:color w:val="605E5C"/>
+      <w:shd w:val="clear" w:color="auto" w:fill="E1DFDD"/>
+    </w:rPr>
+  </w:style>
 </w:styles>
 </file>
 

</xml_diff>